<commit_message>
Gear page: product images for all 32 items (fetch-gear-images.mjs resolves amzn.to → ASIN → main image); contained white image panels
</commit_message>
<xml_diff>
--- a/ParkAtlas/Phase 0.docx
+++ b/ParkAtlas/Phase 0.docx
@@ -7,24 +7,18 @@
         <w:spacing w:before="100" w:beforeAutospacing="1" w:after="100" w:afterAutospacing="1"/>
         <w:outlineLvl w:val="1"/>
         <w:rPr>
-          <w:rFonts w:ascii="Times New Roman" w:eastAsia="Times New Roman" w:hAnsi="Times New Roman" w:cs="Times New Roman"/>
-          <w:b/>
-          <w:bCs/>
-          <w:kern w:val="0"/>
+          <w:b/>
+          <w:bCs/>
           <w:sz w:val="36"/>
           <w:szCs w:val="36"/>
-          <w14:ligatures w14:val="none"/>
-        </w:rPr>
-      </w:pPr>
-      <w:r>
-        <w:rPr>
-          <w:rFonts w:ascii="Times New Roman" w:eastAsia="Times New Roman" w:hAnsi="Times New Roman" w:cs="Times New Roman"/>
-          <w:b/>
-          <w:bCs/>
-          <w:kern w:val="0"/>
+        </w:rPr>
+      </w:pPr>
+      <w:r>
+        <w:rPr>
+          <w:b/>
+          <w:bCs/>
           <w:sz w:val="36"/>
           <w:szCs w:val="36"/>
-          <w14:ligatures w14:val="none"/>
         </w:rPr>
         <w:t>Phase 0 — Before you tell anyone (this week, while build 37 is in review)</w:t>
       </w:r>
@@ -32,21 +26,11 @@
     <w:p>
       <w:pPr>
         <w:spacing w:before="100" w:beforeAutospacing="1" w:after="100" w:afterAutospacing="1"/>
-        <w:rPr>
-          <w:rFonts w:ascii="Times New Roman" w:eastAsia="Times New Roman" w:hAnsi="Times New Roman" w:cs="Times New Roman"/>
-          <w:kern w:val="0"/>
-          <w:sz w:val="24"/>
-          <w14:ligatures w14:val="none"/>
-        </w:rPr>
-      </w:pPr>
-      <w:r>
-        <w:rPr>
-          <w:rFonts w:ascii="Times New Roman" w:eastAsia="Times New Roman" w:hAnsi="Times New Roman" w:cs="Times New Roman"/>
-          <w:b/>
-          <w:bCs/>
-          <w:kern w:val="0"/>
-          <w:sz w:val="24"/>
-          <w14:ligatures w14:val="none"/>
+      </w:pPr>
+      <w:r>
+        <w:rPr>
+          <w:b/>
+          <w:bCs/>
         </w:rPr>
         <w:t>1. App Store page is your landing page. Make it convert.</w:t>
       </w:r>
@@ -58,20 +42,8 @@
           <w:numId w:val="1"/>
         </w:numPr>
         <w:spacing w:before="100" w:beforeAutospacing="1" w:after="100" w:afterAutospacing="1"/>
-        <w:rPr>
-          <w:rFonts w:ascii="Times New Roman" w:eastAsia="Times New Roman" w:hAnsi="Times New Roman" w:cs="Times New Roman"/>
-          <w:kern w:val="0"/>
-          <w:sz w:val="24"/>
-          <w14:ligatures w14:val="none"/>
-        </w:rPr>
-      </w:pPr>
-      <w:r>
-        <w:rPr>
-          <w:rFonts w:ascii="Times New Roman" w:eastAsia="Times New Roman" w:hAnsi="Times New Roman" w:cs="Times New Roman"/>
-          <w:kern w:val="0"/>
-          <w:sz w:val="24"/>
-          <w14:ligatures w14:val="none"/>
-        </w:rPr>
+      </w:pPr>
+      <w:r>
         <w:t>Subtitle/keywords/description from earlier — done.</w:t>
       </w:r>
     </w:p>
@@ -82,87 +54,45 @@
           <w:numId w:val="1"/>
         </w:numPr>
         <w:spacing w:before="100" w:beforeAutospacing="1" w:after="100" w:afterAutospacing="1"/>
-        <w:rPr>
-          <w:rFonts w:ascii="Times New Roman" w:eastAsia="Times New Roman" w:hAnsi="Times New Roman" w:cs="Times New Roman"/>
-          <w:kern w:val="0"/>
-          <w:sz w:val="24"/>
-          <w14:ligatures w14:val="none"/>
-        </w:rPr>
-      </w:pPr>
-      <w:r>
-        <w:rPr>
-          <w:rFonts w:ascii="Times New Roman" w:eastAsia="Times New Roman" w:hAnsi="Times New Roman" w:cs="Times New Roman"/>
-          <w:b/>
-          <w:bCs/>
-          <w:kern w:val="0"/>
-          <w:sz w:val="24"/>
-          <w14:ligatures w14:val="none"/>
+      </w:pPr>
+      <w:r>
+        <w:rPr>
+          <w:b/>
+          <w:bCs/>
         </w:rPr>
         <w:t>First screenshot decides everything.</w:t>
       </w:r>
       <w:r>
-        <w:rPr>
-          <w:rFonts w:ascii="Times New Roman" w:eastAsia="Times New Roman" w:hAnsi="Times New Roman" w:cs="Times New Roman"/>
-          <w:kern w:val="0"/>
-          <w:sz w:val="24"/>
-          <w14:ligatures w14:val="none"/>
-        </w:rPr>
         <w:t xml:space="preserve"> Add a text overlay to </w:t>
       </w:r>
       <w:r>
         <w:rPr>
-          <w:rFonts w:ascii="Courier New" w:eastAsia="Times New Roman" w:hAnsi="Courier New" w:cs="Courier New"/>
-          <w:kern w:val="0"/>
+          <w:rFonts w:ascii="Courier New" w:hAnsi="Courier New" w:cs="Courier New"/>
           <w:szCs w:val="20"/>
-          <w14:ligatures w14:val="none"/>
         </w:rPr>
         <w:t>01-home-progress.png</w:t>
       </w:r>
       <w:r>
-        <w:rPr>
-          <w:rFonts w:ascii="Times New Roman" w:eastAsia="Times New Roman" w:hAnsi="Times New Roman" w:cs="Times New Roman"/>
-          <w:kern w:val="0"/>
-          <w:sz w:val="24"/>
-          <w14:ligatures w14:val="none"/>
-        </w:rPr>
         <w:t xml:space="preserve">: </w:t>
       </w:r>
       <w:r>
         <w:rPr>
-          <w:rFonts w:ascii="Times New Roman" w:eastAsia="Times New Roman" w:hAnsi="Times New Roman" w:cs="Times New Roman"/>
           <w:i/>
           <w:iCs/>
-          <w:kern w:val="0"/>
-          <w:sz w:val="24"/>
-          <w14:ligatures w14:val="none"/>
         </w:rPr>
         <w:t>"All 63 national parks. One ring."</w:t>
       </w:r>
       <w:r>
-        <w:rPr>
-          <w:rFonts w:ascii="Times New Roman" w:eastAsia="Times New Roman" w:hAnsi="Times New Roman" w:cs="Times New Roman"/>
-          <w:kern w:val="0"/>
-          <w:sz w:val="24"/>
-          <w14:ligatures w14:val="none"/>
-        </w:rPr>
         <w:t xml:space="preserve"> Your </w:t>
       </w:r>
       <w:r>
         <w:rPr>
-          <w:rFonts w:ascii="Courier New" w:eastAsia="Times New Roman" w:hAnsi="Courier New" w:cs="Courier New"/>
-          <w:kern w:val="0"/>
+          <w:rFonts w:ascii="Courier New" w:hAnsi="Courier New" w:cs="Courier New"/>
           <w:szCs w:val="20"/>
-          <w14:ligatures w14:val="none"/>
         </w:rPr>
         <w:t>screenshot-overlay-copy.md</w:t>
       </w:r>
       <w:r>
-        <w:rPr>
-          <w:rFonts w:ascii="Times New Roman" w:eastAsia="Times New Roman" w:hAnsi="Times New Roman" w:cs="Times New Roman"/>
-          <w:kern w:val="0"/>
-          <w:sz w:val="24"/>
-          <w14:ligatures w14:val="none"/>
-        </w:rPr>
         <w:t xml:space="preserve"> already has copy; this is the moment to use it.</w:t>
       </w:r>
     </w:p>
@@ -173,257 +103,143 @@
           <w:numId w:val="1"/>
         </w:numPr>
         <w:spacing w:before="100" w:beforeAutospacing="1" w:after="100" w:afterAutospacing="1"/>
-        <w:rPr>
-          <w:rFonts w:ascii="Times New Roman" w:eastAsia="Times New Roman" w:hAnsi="Times New Roman" w:cs="Times New Roman"/>
-          <w:kern w:val="0"/>
-          <w:sz w:val="24"/>
-          <w14:ligatures w14:val="none"/>
-        </w:rPr>
-      </w:pPr>
-      <w:r>
-        <w:rPr>
-          <w:rFonts w:ascii="Times New Roman" w:eastAsia="Times New Roman" w:hAnsi="Times New Roman" w:cs="Times New Roman"/>
-          <w:kern w:val="0"/>
-          <w:sz w:val="24"/>
-          <w14:ligatures w14:val="none"/>
-        </w:rPr>
+      </w:pPr>
+      <w:r>
         <w:t xml:space="preserve">Enable the </w:t>
       </w:r>
       <w:r>
         <w:rPr>
-          <w:rFonts w:ascii="Times New Roman" w:eastAsia="Times New Roman" w:hAnsi="Times New Roman" w:cs="Times New Roman"/>
-          <w:b/>
-          <w:bCs/>
-          <w:kern w:val="0"/>
-          <w:sz w:val="24"/>
-          <w14:ligatures w14:val="none"/>
+          <w:b/>
+          <w:bCs/>
         </w:rPr>
         <w:t>App Preview video</w:t>
       </w:r>
       <w:r>
-        <w:rPr>
-          <w:rFonts w:ascii="Times New Roman" w:eastAsia="Times New Roman" w:hAnsi="Times New Roman" w:cs="Times New Roman"/>
-          <w:kern w:val="0"/>
-          <w:sz w:val="24"/>
-          <w14:ligatures w14:val="none"/>
-        </w:rPr>
         <w:t xml:space="preserve"> later, not now.</w:t>
       </w:r>
     </w:p>
     <w:p>
       <w:pPr>
         <w:spacing w:before="100" w:beforeAutospacing="1" w:after="100" w:afterAutospacing="1"/>
-        <w:rPr>
-          <w:rFonts w:ascii="Times New Roman" w:eastAsia="Times New Roman" w:hAnsi="Times New Roman" w:cs="Times New Roman"/>
-          <w:kern w:val="0"/>
-          <w:sz w:val="24"/>
-          <w14:ligatures w14:val="none"/>
-        </w:rPr>
-      </w:pPr>
-      <w:r>
-        <w:rPr>
-          <w:rFonts w:ascii="Times New Roman" w:eastAsia="Times New Roman" w:hAnsi="Times New Roman" w:cs="Times New Roman"/>
-          <w:b/>
-          <w:bCs/>
-          <w:kern w:val="0"/>
-          <w:sz w:val="24"/>
-          <w14:ligatures w14:val="none"/>
+      </w:pPr>
+      <w:r>
+        <w:rPr>
+          <w:b/>
+          <w:bCs/>
         </w:rPr>
         <w:t>2. Set up the three accounts under one handle:</w:t>
       </w:r>
       <w:r>
-        <w:rPr>
-          <w:rFonts w:ascii="Times New Roman" w:eastAsia="Times New Roman" w:hAnsi="Times New Roman" w:cs="Times New Roman"/>
-          <w:kern w:val="0"/>
-          <w:sz w:val="24"/>
-          <w14:ligatures w14:val="none"/>
-        </w:rPr>
         <w:t xml:space="preserve"> </w:t>
       </w:r>
       <w:r>
         <w:rPr>
-          <w:rFonts w:ascii="Courier New" w:eastAsia="Times New Roman" w:hAnsi="Courier New" w:cs="Courier New"/>
-          <w:kern w:val="0"/>
+          <w:rFonts w:ascii="Courier New" w:hAnsi="Courier New" w:cs="Courier New"/>
           <w:szCs w:val="20"/>
-          <w14:ligatures w14:val="none"/>
-        </w:rPr>
-        <w:t>@parkatlasapp</w:t>
-      </w:r>
-      <w:r>
-        <w:rPr>
-          <w:rFonts w:ascii="Times New Roman" w:eastAsia="Times New Roman" w:hAnsi="Times New Roman" w:cs="Times New Roman"/>
-          <w:kern w:val="0"/>
-          <w:sz w:val="24"/>
-          <w14:ligatures w14:val="none"/>
-        </w:rPr>
+        </w:rPr>
+        <w:t>@</w:t>
+      </w:r>
+      <w:r>
+        <w:rPr>
+          <w:rFonts w:ascii="Courier New" w:hAnsi="Courier New" w:cs="Courier New"/>
+          <w:szCs w:val="20"/>
+        </w:rPr>
+        <w:t>PARKATLAS.IO</w:t>
+      </w:r>
+      <w:r>
         <w:t xml:space="preserve"> on Instagram, TikTok, and Reddit. Bio: "Track your journey through all 63 U.S. national parks. Free on iOS." + App Store link. Use a </w:t>
       </w:r>
       <w:r>
         <w:rPr>
-          <w:rFonts w:ascii="Times New Roman" w:eastAsia="Times New Roman" w:hAnsi="Times New Roman" w:cs="Times New Roman"/>
-          <w:b/>
-          <w:bCs/>
-          <w:kern w:val="0"/>
-          <w:sz w:val="24"/>
-          <w14:ligatures w14:val="none"/>
+          <w:b/>
+          <w:bCs/>
         </w:rPr>
         <w:t>Smart App Banner / short link</w:t>
       </w:r>
       <w:r>
-        <w:rPr>
-          <w:rFonts w:ascii="Times New Roman" w:eastAsia="Times New Roman" w:hAnsi="Times New Roman" w:cs="Times New Roman"/>
-          <w:kern w:val="0"/>
-          <w:sz w:val="24"/>
-          <w14:ligatures w14:val="none"/>
-        </w:rPr>
         <w:t xml:space="preserve"> (</w:t>
       </w:r>
       <w:r>
         <w:rPr>
-          <w:rFonts w:ascii="Courier New" w:eastAsia="Times New Roman" w:hAnsi="Courier New" w:cs="Courier New"/>
-          <w:kern w:val="0"/>
+          <w:rFonts w:ascii="Courier New" w:hAnsi="Courier New" w:cs="Courier New"/>
           <w:szCs w:val="20"/>
-          <w14:ligatures w14:val="none"/>
-        </w:rPr>
-        <w:t>parkatlas.app/get</w:t>
-      </w:r>
-      <w:r>
-        <w:rPr>
-          <w:rFonts w:ascii="Times New Roman" w:eastAsia="Times New Roman" w:hAnsi="Times New Roman" w:cs="Times New Roman"/>
-          <w:kern w:val="0"/>
-          <w:sz w:val="24"/>
-          <w14:ligatures w14:val="none"/>
-        </w:rPr>
+        </w:rPr>
+        <w:t>PARKATLAS.IO</w:t>
+      </w:r>
+      <w:r>
+        <w:rPr>
+          <w:rFonts w:ascii="Courier New" w:hAnsi="Courier New" w:cs="Courier New"/>
+          <w:szCs w:val="20"/>
+        </w:rPr>
+        <w:t>/get</w:t>
+      </w:r>
+      <w:r>
         <w:t xml:space="preserve"> if you own the domain; otherwise the direct </w:t>
       </w:r>
       <w:r>
         <w:rPr>
-          <w:rFonts w:ascii="Courier New" w:eastAsia="Times New Roman" w:hAnsi="Courier New" w:cs="Courier New"/>
-          <w:kern w:val="0"/>
+          <w:rFonts w:ascii="Courier New" w:hAnsi="Courier New" w:cs="Courier New"/>
           <w:szCs w:val="20"/>
-          <w14:ligatures w14:val="none"/>
         </w:rPr>
         <w:t>apps.apple.com</w:t>
       </w:r>
       <w:r>
-        <w:rPr>
-          <w:rFonts w:ascii="Times New Roman" w:eastAsia="Times New Roman" w:hAnsi="Times New Roman" w:cs="Times New Roman"/>
-          <w:kern w:val="0"/>
-          <w:sz w:val="24"/>
-          <w14:ligatures w14:val="none"/>
-        </w:rPr>
         <w:t xml:space="preserve"> link).</w:t>
       </w:r>
     </w:p>
     <w:p>
       <w:pPr>
         <w:spacing w:before="100" w:beforeAutospacing="1" w:after="100" w:afterAutospacing="1"/>
-        <w:rPr>
-          <w:rFonts w:ascii="Times New Roman" w:eastAsia="Times New Roman" w:hAnsi="Times New Roman" w:cs="Times New Roman"/>
-          <w:kern w:val="0"/>
-          <w:sz w:val="24"/>
-          <w14:ligatures w14:val="none"/>
-        </w:rPr>
-      </w:pPr>
-      <w:r>
-        <w:rPr>
-          <w:rFonts w:ascii="Times New Roman" w:eastAsia="Times New Roman" w:hAnsi="Times New Roman" w:cs="Times New Roman"/>
-          <w:b/>
-          <w:bCs/>
-          <w:kern w:val="0"/>
-          <w:sz w:val="24"/>
-          <w14:ligatures w14:val="none"/>
+      </w:pPr>
+      <w:r>
+        <w:rPr>
+          <w:b/>
+          <w:bCs/>
         </w:rPr>
         <w:t>3. Seed your own account.</w:t>
       </w:r>
       <w:r>
-        <w:rPr>
-          <w:rFonts w:ascii="Times New Roman" w:eastAsia="Times New Roman" w:hAnsi="Times New Roman" w:cs="Times New Roman"/>
-          <w:kern w:val="0"/>
-          <w:sz w:val="24"/>
-          <w14:ligatures w14:val="none"/>
-        </w:rPr>
         <w:t xml:space="preserve"> Log your real parks. You'll need authentic content, and a 0-park account can't demo the product.</w:t>
       </w:r>
     </w:p>
     <w:p>
       <w:pPr>
         <w:spacing w:before="100" w:beforeAutospacing="1" w:after="100" w:afterAutospacing="1"/>
-        <w:rPr>
-          <w:rFonts w:ascii="Times New Roman" w:eastAsia="Times New Roman" w:hAnsi="Times New Roman" w:cs="Times New Roman"/>
-          <w:kern w:val="0"/>
-          <w:sz w:val="24"/>
-          <w14:ligatures w14:val="none"/>
-        </w:rPr>
-      </w:pPr>
-      <w:r>
-        <w:rPr>
-          <w:rFonts w:ascii="Times New Roman" w:eastAsia="Times New Roman" w:hAnsi="Times New Roman" w:cs="Times New Roman"/>
-          <w:b/>
-          <w:bCs/>
-          <w:kern w:val="0"/>
-          <w:sz w:val="24"/>
-          <w14:ligatures w14:val="none"/>
+      </w:pPr>
+      <w:r>
+        <w:rPr>
+          <w:b/>
+          <w:bCs/>
         </w:rPr>
         <w:t>4. Turn on the review prompt.</w:t>
       </w:r>
       <w:r>
-        <w:rPr>
-          <w:rFonts w:ascii="Times New Roman" w:eastAsia="Times New Roman" w:hAnsi="Times New Roman" w:cs="Times New Roman"/>
-          <w:kern w:val="0"/>
-          <w:sz w:val="24"/>
-          <w14:ligatures w14:val="none"/>
-        </w:rPr>
         <w:t xml:space="preserve"> You already ask for a rating at 5 parks — good. Early reviews are the single biggest trust signal on the page.</w:t>
       </w:r>
     </w:p>
     <w:p>
       <w:pPr>
         <w:spacing w:before="100" w:beforeAutospacing="1" w:after="100" w:afterAutospacing="1"/>
-        <w:rPr>
-          <w:rFonts w:ascii="Times New Roman" w:eastAsia="Times New Roman" w:hAnsi="Times New Roman" w:cs="Times New Roman"/>
-          <w:kern w:val="0"/>
-          <w:sz w:val="24"/>
-          <w14:ligatures w14:val="none"/>
-        </w:rPr>
-      </w:pPr>
-      <w:r>
-        <w:rPr>
-          <w:rFonts w:ascii="Times New Roman" w:eastAsia="Times New Roman" w:hAnsi="Times New Roman" w:cs="Times New Roman"/>
-          <w:b/>
-          <w:bCs/>
-          <w:kern w:val="0"/>
-          <w:sz w:val="24"/>
-          <w14:ligatures w14:val="none"/>
+      </w:pPr>
+      <w:r>
+        <w:rPr>
+          <w:b/>
+          <w:bCs/>
         </w:rPr>
         <w:t>5. Fix the one thing that kills shares:</w:t>
       </w:r>
       <w:r>
-        <w:rPr>
-          <w:rFonts w:ascii="Times New Roman" w:eastAsia="Times New Roman" w:hAnsi="Times New Roman" w:cs="Times New Roman"/>
-          <w:kern w:val="0"/>
-          <w:sz w:val="24"/>
-          <w14:ligatures w14:val="none"/>
-        </w:rPr>
         <w:t xml:space="preserve"> make sure the share card, when saved to Photos, looks perfect on Instagram Stories (9:16). Right now it's 3:4. Add a Stories-ratio variant — that's 30 minutes of work and it's where parks people actually post.</w:t>
       </w:r>
     </w:p>
     <w:p>
-      <w:pPr>
-        <w:rPr>
-          <w:rFonts w:ascii="Times New Roman" w:eastAsia="Times New Roman" w:hAnsi="Times New Roman" w:cs="Times New Roman"/>
-          <w:kern w:val="0"/>
-          <w:sz w:val="24"/>
-          <w14:ligatures w14:val="none"/>
-        </w:rPr>
-      </w:pPr>
       <w:r>
         <w:rPr>
           <w:noProof/>
         </w:rPr>
       </w:r>
       <w:r>
-        <w:pict w14:anchorId="38A976C5">
+        <w:pict w14:anchorId="476163FB">
           <v:rect id="Horizontal Line 1" o:spid="_x0000_s1029" style="width:468pt;height:.1pt;visibility:visible;mso-wrap-style:square;mso-left-percent:-10001;mso-top-percent:-10001;mso-position-horizontal:absolute;mso-position-horizontal-relative:char;mso-position-vertical:absolute;mso-position-vertical-relative:line;mso-left-percent:-10001;mso-top-percent:-10001;v-text-anchor:top" o:gfxdata="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" filled="f">
             <o:lock v:ext="edit" rotation="t" aspectratio="t" verticies="t" text="t" shapetype="t"/>
             <w10:anchorlock/>
@@ -436,24 +252,18 @@
         <w:spacing w:before="100" w:beforeAutospacing="1" w:after="100" w:afterAutospacing="1"/>
         <w:outlineLvl w:val="1"/>
         <w:rPr>
-          <w:rFonts w:ascii="Times New Roman" w:eastAsia="Times New Roman" w:hAnsi="Times New Roman" w:cs="Times New Roman"/>
-          <w:b/>
-          <w:bCs/>
-          <w:kern w:val="0"/>
+          <w:b/>
+          <w:bCs/>
           <w:sz w:val="36"/>
           <w:szCs w:val="36"/>
-          <w14:ligatures w14:val="none"/>
-        </w:rPr>
-      </w:pPr>
-      <w:r>
-        <w:rPr>
-          <w:rFonts w:ascii="Times New Roman" w:eastAsia="Times New Roman" w:hAnsi="Times New Roman" w:cs="Times New Roman"/>
-          <w:b/>
-          <w:bCs/>
-          <w:kern w:val="0"/>
+        </w:rPr>
+      </w:pPr>
+      <w:r>
+        <w:rPr>
+          <w:b/>
+          <w:bCs/>
           <w:sz w:val="36"/>
           <w:szCs w:val="36"/>
-          <w14:ligatures w14:val="none"/>
         </w:rPr>
         <w:t>Phase 1 — Launch week (the day 2.0 goes live)</w:t>
       </w:r>
@@ -461,31 +271,15 @@
     <w:p>
       <w:pPr>
         <w:spacing w:before="100" w:beforeAutospacing="1" w:after="100" w:afterAutospacing="1"/>
-        <w:rPr>
-          <w:rFonts w:ascii="Times New Roman" w:eastAsia="Times New Roman" w:hAnsi="Times New Roman" w:cs="Times New Roman"/>
-          <w:kern w:val="0"/>
-          <w:sz w:val="24"/>
-          <w14:ligatures w14:val="none"/>
-        </w:rPr>
-      </w:pPr>
-      <w:r>
-        <w:rPr>
-          <w:rFonts w:ascii="Times New Roman" w:eastAsia="Times New Roman" w:hAnsi="Times New Roman" w:cs="Times New Roman"/>
-          <w:b/>
-          <w:bCs/>
-          <w:kern w:val="0"/>
-          <w:sz w:val="24"/>
-          <w14:ligatures w14:val="none"/>
+      </w:pPr>
+      <w:r>
+        <w:rPr>
+          <w:b/>
+          <w:bCs/>
         </w:rPr>
         <w:t>Reddit is your primary channel.</w:t>
       </w:r>
       <w:r>
-        <w:rPr>
-          <w:rFonts w:ascii="Times New Roman" w:eastAsia="Times New Roman" w:hAnsi="Times New Roman" w:cs="Times New Roman"/>
-          <w:kern w:val="0"/>
-          <w:sz w:val="24"/>
-          <w14:ligatures w14:val="none"/>
-        </w:rPr>
         <w:t xml:space="preserve"> Parks Reddit is large, text-friendly, and hates ads but loves builders.</w:t>
       </w:r>
     </w:p>
@@ -521,22 +315,14 @@
             <w:pPr>
               <w:jc w:val="center"/>
               <w:rPr>
-                <w:rFonts w:ascii="Times New Roman" w:eastAsia="Times New Roman" w:hAnsi="Times New Roman" w:cs="Times New Roman"/>
                 <w:b/>
                 <w:bCs/>
-                <w:kern w:val="0"/>
-                <w:sz w:val="24"/>
-                <w14:ligatures w14:val="none"/>
               </w:rPr>
             </w:pPr>
             <w:r>
               <w:rPr>
-                <w:rFonts w:ascii="Times New Roman" w:eastAsia="Times New Roman" w:hAnsi="Times New Roman" w:cs="Times New Roman"/>
                 <w:b/>
                 <w:bCs/>
-                <w:kern w:val="0"/>
-                <w:sz w:val="24"/>
-                <w14:ligatures w14:val="none"/>
               </w:rPr>
               <w:t>Subreddit</w:t>
             </w:r>
@@ -552,22 +338,14 @@
             <w:pPr>
               <w:jc w:val="center"/>
               <w:rPr>
-                <w:rFonts w:ascii="Times New Roman" w:eastAsia="Times New Roman" w:hAnsi="Times New Roman" w:cs="Times New Roman"/>
                 <w:b/>
                 <w:bCs/>
-                <w:kern w:val="0"/>
-                <w:sz w:val="24"/>
-                <w14:ligatures w14:val="none"/>
               </w:rPr>
             </w:pPr>
             <w:r>
               <w:rPr>
-                <w:rFonts w:ascii="Times New Roman" w:eastAsia="Times New Roman" w:hAnsi="Times New Roman" w:cs="Times New Roman"/>
                 <w:b/>
                 <w:bCs/>
-                <w:kern w:val="0"/>
-                <w:sz w:val="24"/>
-                <w14:ligatures w14:val="none"/>
               </w:rPr>
               <w:t>Members</w:t>
             </w:r>
@@ -583,22 +361,14 @@
             <w:pPr>
               <w:jc w:val="center"/>
               <w:rPr>
-                <w:rFonts w:ascii="Times New Roman" w:eastAsia="Times New Roman" w:hAnsi="Times New Roman" w:cs="Times New Roman"/>
                 <w:b/>
                 <w:bCs/>
-                <w:kern w:val="0"/>
-                <w:sz w:val="24"/>
-                <w14:ligatures w14:val="none"/>
               </w:rPr>
             </w:pPr>
             <w:r>
               <w:rPr>
-                <w:rFonts w:ascii="Times New Roman" w:eastAsia="Times New Roman" w:hAnsi="Times New Roman" w:cs="Times New Roman"/>
                 <w:b/>
                 <w:bCs/>
-                <w:kern w:val="0"/>
-                <w:sz w:val="24"/>
-                <w14:ligatures w14:val="none"/>
               </w:rPr>
               <w:t>Angle</w:t>
             </w:r>
@@ -616,21 +386,7 @@
             <w:hideMark/>
           </w:tcPr>
           <w:p>
-            <w:pPr>
-              <w:rPr>
-                <w:rFonts w:ascii="Times New Roman" w:eastAsia="Times New Roman" w:hAnsi="Times New Roman" w:cs="Times New Roman"/>
-                <w:kern w:val="0"/>
-                <w:sz w:val="24"/>
-                <w14:ligatures w14:val="none"/>
-              </w:rPr>
-            </w:pPr>
-            <w:r>
-              <w:rPr>
-                <w:rFonts w:ascii="Times New Roman" w:eastAsia="Times New Roman" w:hAnsi="Times New Roman" w:cs="Times New Roman"/>
-                <w:kern w:val="0"/>
-                <w:sz w:val="24"/>
-                <w14:ligatures w14:val="none"/>
-              </w:rPr>
+            <w:r>
               <w:t>r/nationalparks</w:t>
             </w:r>
           </w:p>
@@ -642,21 +398,7 @@
             <w:hideMark/>
           </w:tcPr>
           <w:p>
-            <w:pPr>
-              <w:rPr>
-                <w:rFonts w:ascii="Times New Roman" w:eastAsia="Times New Roman" w:hAnsi="Times New Roman" w:cs="Times New Roman"/>
-                <w:kern w:val="0"/>
-                <w:sz w:val="24"/>
-                <w14:ligatures w14:val="none"/>
-              </w:rPr>
-            </w:pPr>
-            <w:r>
-              <w:rPr>
-                <w:rFonts w:ascii="Times New Roman" w:eastAsia="Times New Roman" w:hAnsi="Times New Roman" w:cs="Times New Roman"/>
-                <w:kern w:val="0"/>
-                <w:sz w:val="24"/>
-                <w14:ligatures w14:val="none"/>
-              </w:rPr>
+            <w:r>
               <w:t>~1M</w:t>
             </w:r>
           </w:p>
@@ -668,21 +410,7 @@
             <w:hideMark/>
           </w:tcPr>
           <w:p>
-            <w:pPr>
-              <w:rPr>
-                <w:rFonts w:ascii="Times New Roman" w:eastAsia="Times New Roman" w:hAnsi="Times New Roman" w:cs="Times New Roman"/>
-                <w:kern w:val="0"/>
-                <w:sz w:val="24"/>
-                <w14:ligatures w14:val="none"/>
-              </w:rPr>
-            </w:pPr>
-            <w:r>
-              <w:rPr>
-                <w:rFonts w:ascii="Times New Roman" w:eastAsia="Times New Roman" w:hAnsi="Times New Roman" w:cs="Times New Roman"/>
-                <w:kern w:val="0"/>
-                <w:sz w:val="24"/>
-                <w14:ligatures w14:val="none"/>
-              </w:rPr>
+            <w:r>
               <w:t>"I built a free app to track all 63 — here's what I learned"</w:t>
             </w:r>
           </w:p>
@@ -699,21 +427,7 @@
             <w:hideMark/>
           </w:tcPr>
           <w:p>
-            <w:pPr>
-              <w:rPr>
-                <w:rFonts w:ascii="Times New Roman" w:eastAsia="Times New Roman" w:hAnsi="Times New Roman" w:cs="Times New Roman"/>
-                <w:kern w:val="0"/>
-                <w:sz w:val="24"/>
-                <w14:ligatures w14:val="none"/>
-              </w:rPr>
-            </w:pPr>
-            <w:r>
-              <w:rPr>
-                <w:rFonts w:ascii="Times New Roman" w:eastAsia="Times New Roman" w:hAnsi="Times New Roman" w:cs="Times New Roman"/>
-                <w:kern w:val="0"/>
-                <w:sz w:val="24"/>
-                <w14:ligatures w14:val="none"/>
-              </w:rPr>
+            <w:r>
               <w:t>r/NationalPark</w:t>
             </w:r>
           </w:p>
@@ -725,21 +439,7 @@
             <w:hideMark/>
           </w:tcPr>
           <w:p>
-            <w:pPr>
-              <w:rPr>
-                <w:rFonts w:ascii="Times New Roman" w:eastAsia="Times New Roman" w:hAnsi="Times New Roman" w:cs="Times New Roman"/>
-                <w:kern w:val="0"/>
-                <w:sz w:val="24"/>
-                <w14:ligatures w14:val="none"/>
-              </w:rPr>
-            </w:pPr>
-            <w:r>
-              <w:rPr>
-                <w:rFonts w:ascii="Times New Roman" w:eastAsia="Times New Roman" w:hAnsi="Times New Roman" w:cs="Times New Roman"/>
-                <w:kern w:val="0"/>
-                <w:sz w:val="24"/>
-                <w14:ligatures w14:val="none"/>
-              </w:rPr>
+            <w:r>
               <w:t>~250k</w:t>
             </w:r>
           </w:p>
@@ -751,21 +451,7 @@
             <w:hideMark/>
           </w:tcPr>
           <w:p>
-            <w:pPr>
-              <w:rPr>
-                <w:rFonts w:ascii="Times New Roman" w:eastAsia="Times New Roman" w:hAnsi="Times New Roman" w:cs="Times New Roman"/>
-                <w:kern w:val="0"/>
-                <w:sz w:val="24"/>
-                <w14:ligatures w14:val="none"/>
-              </w:rPr>
-            </w:pPr>
-            <w:r>
-              <w:rPr>
-                <w:rFonts w:ascii="Times New Roman" w:eastAsia="Times New Roman" w:hAnsi="Times New Roman" w:cs="Times New Roman"/>
-                <w:kern w:val="0"/>
-                <w:sz w:val="24"/>
-                <w14:ligatures w14:val="none"/>
-              </w:rPr>
+            <w:r>
               <w:t>Same, different day</w:t>
             </w:r>
           </w:p>
@@ -782,21 +468,7 @@
             <w:hideMark/>
           </w:tcPr>
           <w:p>
-            <w:pPr>
-              <w:rPr>
-                <w:rFonts w:ascii="Times New Roman" w:eastAsia="Times New Roman" w:hAnsi="Times New Roman" w:cs="Times New Roman"/>
-                <w:kern w:val="0"/>
-                <w:sz w:val="24"/>
-                <w14:ligatures w14:val="none"/>
-              </w:rPr>
-            </w:pPr>
-            <w:r>
-              <w:rPr>
-                <w:rFonts w:ascii="Times New Roman" w:eastAsia="Times New Roman" w:hAnsi="Times New Roman" w:cs="Times New Roman"/>
-                <w:kern w:val="0"/>
-                <w:sz w:val="24"/>
-                <w14:ligatures w14:val="none"/>
-              </w:rPr>
+            <w:r>
               <w:t>r/hiking</w:t>
             </w:r>
           </w:p>
@@ -808,21 +480,7 @@
             <w:hideMark/>
           </w:tcPr>
           <w:p>
-            <w:pPr>
-              <w:rPr>
-                <w:rFonts w:ascii="Times New Roman" w:eastAsia="Times New Roman" w:hAnsi="Times New Roman" w:cs="Times New Roman"/>
-                <w:kern w:val="0"/>
-                <w:sz w:val="24"/>
-                <w14:ligatures w14:val="none"/>
-              </w:rPr>
-            </w:pPr>
-            <w:r>
-              <w:rPr>
-                <w:rFonts w:ascii="Times New Roman" w:eastAsia="Times New Roman" w:hAnsi="Times New Roman" w:cs="Times New Roman"/>
-                <w:kern w:val="0"/>
-                <w:sz w:val="24"/>
-                <w14:ligatures w14:val="none"/>
-              </w:rPr>
+            <w:r>
               <w:t>~3M</w:t>
             </w:r>
           </w:p>
@@ -834,21 +492,7 @@
             <w:hideMark/>
           </w:tcPr>
           <w:p>
-            <w:pPr>
-              <w:rPr>
-                <w:rFonts w:ascii="Times New Roman" w:eastAsia="Times New Roman" w:hAnsi="Times New Roman" w:cs="Times New Roman"/>
-                <w:kern w:val="0"/>
-                <w:sz w:val="24"/>
-                <w14:ligatures w14:val="none"/>
-              </w:rPr>
-            </w:pPr>
-            <w:r>
-              <w:rPr>
-                <w:rFonts w:ascii="Times New Roman" w:eastAsia="Times New Roman" w:hAnsi="Times New Roman" w:cs="Times New Roman"/>
-                <w:kern w:val="0"/>
-                <w:sz w:val="24"/>
-                <w14:ligatures w14:val="none"/>
-              </w:rPr>
+            <w:r>
               <w:t>Trail-logging angle</w:t>
             </w:r>
           </w:p>
@@ -865,21 +509,7 @@
             <w:hideMark/>
           </w:tcPr>
           <w:p>
-            <w:pPr>
-              <w:rPr>
-                <w:rFonts w:ascii="Times New Roman" w:eastAsia="Times New Roman" w:hAnsi="Times New Roman" w:cs="Times New Roman"/>
-                <w:kern w:val="0"/>
-                <w:sz w:val="24"/>
-                <w14:ligatures w14:val="none"/>
-              </w:rPr>
-            </w:pPr>
-            <w:r>
-              <w:rPr>
-                <w:rFonts w:ascii="Times New Roman" w:eastAsia="Times New Roman" w:hAnsi="Times New Roman" w:cs="Times New Roman"/>
-                <w:kern w:val="0"/>
-                <w:sz w:val="24"/>
-                <w14:ligatures w14:val="none"/>
-              </w:rPr>
+            <w:r>
               <w:t>r/camping</w:t>
             </w:r>
           </w:p>
@@ -891,21 +521,7 @@
             <w:hideMark/>
           </w:tcPr>
           <w:p>
-            <w:pPr>
-              <w:rPr>
-                <w:rFonts w:ascii="Times New Roman" w:eastAsia="Times New Roman" w:hAnsi="Times New Roman" w:cs="Times New Roman"/>
-                <w:kern w:val="0"/>
-                <w:sz w:val="24"/>
-                <w14:ligatures w14:val="none"/>
-              </w:rPr>
-            </w:pPr>
-            <w:r>
-              <w:rPr>
-                <w:rFonts w:ascii="Times New Roman" w:eastAsia="Times New Roman" w:hAnsi="Times New Roman" w:cs="Times New Roman"/>
-                <w:kern w:val="0"/>
-                <w:sz w:val="24"/>
-                <w14:ligatures w14:val="none"/>
-              </w:rPr>
+            <w:r>
               <w:t>~4M</w:t>
             </w:r>
           </w:p>
@@ -917,21 +533,7 @@
             <w:hideMark/>
           </w:tcPr>
           <w:p>
-            <w:pPr>
-              <w:rPr>
-                <w:rFonts w:ascii="Times New Roman" w:eastAsia="Times New Roman" w:hAnsi="Times New Roman" w:cs="Times New Roman"/>
-                <w:kern w:val="0"/>
-                <w:sz w:val="24"/>
-                <w14:ligatures w14:val="none"/>
-              </w:rPr>
-            </w:pPr>
-            <w:r>
-              <w:rPr>
-                <w:rFonts w:ascii="Times New Roman" w:eastAsia="Times New Roman" w:hAnsi="Times New Roman" w:cs="Times New Roman"/>
-                <w:kern w:val="0"/>
-                <w:sz w:val="24"/>
-                <w14:ligatures w14:val="none"/>
-              </w:rPr>
+            <w:r>
               <w:t>Nearby parks / wishlist angle</w:t>
             </w:r>
           </w:p>
@@ -948,21 +550,7 @@
             <w:hideMark/>
           </w:tcPr>
           <w:p>
-            <w:pPr>
-              <w:rPr>
-                <w:rFonts w:ascii="Times New Roman" w:eastAsia="Times New Roman" w:hAnsi="Times New Roman" w:cs="Times New Roman"/>
-                <w:kern w:val="0"/>
-                <w:sz w:val="24"/>
-                <w14:ligatures w14:val="none"/>
-              </w:rPr>
-            </w:pPr>
-            <w:r>
-              <w:rPr>
-                <w:rFonts w:ascii="Times New Roman" w:eastAsia="Times New Roman" w:hAnsi="Times New Roman" w:cs="Times New Roman"/>
-                <w:kern w:val="0"/>
-                <w:sz w:val="24"/>
-                <w14:ligatures w14:val="none"/>
-              </w:rPr>
+            <w:r>
               <w:t>r/roadtrip</w:t>
             </w:r>
           </w:p>
@@ -974,21 +562,7 @@
             <w:hideMark/>
           </w:tcPr>
           <w:p>
-            <w:pPr>
-              <w:rPr>
-                <w:rFonts w:ascii="Times New Roman" w:eastAsia="Times New Roman" w:hAnsi="Times New Roman" w:cs="Times New Roman"/>
-                <w:kern w:val="0"/>
-                <w:sz w:val="24"/>
-                <w14:ligatures w14:val="none"/>
-              </w:rPr>
-            </w:pPr>
-            <w:r>
-              <w:rPr>
-                <w:rFonts w:ascii="Times New Roman" w:eastAsia="Times New Roman" w:hAnsi="Times New Roman" w:cs="Times New Roman"/>
-                <w:kern w:val="0"/>
-                <w:sz w:val="24"/>
-                <w14:ligatures w14:val="none"/>
-              </w:rPr>
+            <w:r>
               <w:t>~500k</w:t>
             </w:r>
           </w:p>
@@ -1000,21 +574,7 @@
             <w:hideMark/>
           </w:tcPr>
           <w:p>
-            <w:pPr>
-              <w:rPr>
-                <w:rFonts w:ascii="Times New Roman" w:eastAsia="Times New Roman" w:hAnsi="Times New Roman" w:cs="Times New Roman"/>
-                <w:kern w:val="0"/>
-                <w:sz w:val="24"/>
-                <w14:ligatures w14:val="none"/>
-              </w:rPr>
-            </w:pPr>
-            <w:r>
-              <w:rPr>
-                <w:rFonts w:ascii="Times New Roman" w:eastAsia="Times New Roman" w:hAnsi="Times New Roman" w:cs="Times New Roman"/>
-                <w:kern w:val="0"/>
-                <w:sz w:val="24"/>
-                <w14:ligatures w14:val="none"/>
-              </w:rPr>
+            <w:r>
               <w:t>"Plan a 63-park road trip" angle</w:t>
             </w:r>
           </w:p>
@@ -1031,21 +591,7 @@
             <w:hideMark/>
           </w:tcPr>
           <w:p>
-            <w:pPr>
-              <w:rPr>
-                <w:rFonts w:ascii="Times New Roman" w:eastAsia="Times New Roman" w:hAnsi="Times New Roman" w:cs="Times New Roman"/>
-                <w:kern w:val="0"/>
-                <w:sz w:val="24"/>
-                <w14:ligatures w14:val="none"/>
-              </w:rPr>
-            </w:pPr>
-            <w:r>
-              <w:rPr>
-                <w:rFonts w:ascii="Times New Roman" w:eastAsia="Times New Roman" w:hAnsi="Times New Roman" w:cs="Times New Roman"/>
-                <w:kern w:val="0"/>
-                <w:sz w:val="24"/>
-                <w14:ligatures w14:val="none"/>
-              </w:rPr>
+            <w:r>
               <w:t>r/SideProject, r/reactnative</w:t>
             </w:r>
           </w:p>
@@ -1057,21 +603,7 @@
             <w:hideMark/>
           </w:tcPr>
           <w:p>
-            <w:pPr>
-              <w:rPr>
-                <w:rFonts w:ascii="Times New Roman" w:eastAsia="Times New Roman" w:hAnsi="Times New Roman" w:cs="Times New Roman"/>
-                <w:kern w:val="0"/>
-                <w:sz w:val="24"/>
-                <w14:ligatures w14:val="none"/>
-              </w:rPr>
-            </w:pPr>
-            <w:r>
-              <w:rPr>
-                <w:rFonts w:ascii="Times New Roman" w:eastAsia="Times New Roman" w:hAnsi="Times New Roman" w:cs="Times New Roman"/>
-                <w:kern w:val="0"/>
-                <w:sz w:val="24"/>
-                <w14:ligatures w14:val="none"/>
-              </w:rPr>
+            <w:r>
               <w:t>dev</w:t>
             </w:r>
           </w:p>
@@ -1083,21 +615,7 @@
             <w:hideMark/>
           </w:tcPr>
           <w:p>
-            <w:pPr>
-              <w:rPr>
-                <w:rFonts w:ascii="Times New Roman" w:eastAsia="Times New Roman" w:hAnsi="Times New Roman" w:cs="Times New Roman"/>
-                <w:kern w:val="0"/>
-                <w:sz w:val="24"/>
-                <w14:ligatures w14:val="none"/>
-              </w:rPr>
-            </w:pPr>
-            <w:r>
-              <w:rPr>
-                <w:rFonts w:ascii="Times New Roman" w:eastAsia="Times New Roman" w:hAnsi="Times New Roman" w:cs="Times New Roman"/>
-                <w:kern w:val="0"/>
-                <w:sz w:val="24"/>
-                <w14:ligatures w14:val="none"/>
-              </w:rPr>
+            <w:r>
               <w:t>"Shipped v2.0 of my Expo app" — devs download and upvote</w:t>
             </w:r>
           </w:p>
@@ -1107,21 +625,11 @@
     <w:p>
       <w:pPr>
         <w:spacing w:before="100" w:beforeAutospacing="1" w:after="100" w:afterAutospacing="1"/>
-        <w:rPr>
-          <w:rFonts w:ascii="Times New Roman" w:eastAsia="Times New Roman" w:hAnsi="Times New Roman" w:cs="Times New Roman"/>
-          <w:kern w:val="0"/>
-          <w:sz w:val="24"/>
-          <w14:ligatures w14:val="none"/>
-        </w:rPr>
-      </w:pPr>
-      <w:r>
-        <w:rPr>
-          <w:rFonts w:ascii="Times New Roman" w:eastAsia="Times New Roman" w:hAnsi="Times New Roman" w:cs="Times New Roman"/>
-          <w:b/>
-          <w:bCs/>
-          <w:kern w:val="0"/>
-          <w:sz w:val="24"/>
-          <w14:ligatures w14:val="none"/>
+      </w:pPr>
+      <w:r>
+        <w:rPr>
+          <w:b/>
+          <w:bCs/>
         </w:rPr>
         <w:t>Rules that matter:</w:t>
       </w:r>
@@ -1133,41 +641,19 @@
           <w:numId w:val="2"/>
         </w:numPr>
         <w:spacing w:before="100" w:beforeAutospacing="1" w:after="100" w:afterAutospacing="1"/>
-        <w:rPr>
-          <w:rFonts w:ascii="Times New Roman" w:eastAsia="Times New Roman" w:hAnsi="Times New Roman" w:cs="Times New Roman"/>
-          <w:kern w:val="0"/>
-          <w:sz w:val="24"/>
-          <w14:ligatures w14:val="none"/>
-        </w:rPr>
-      </w:pPr>
-      <w:r>
-        <w:rPr>
-          <w:rFonts w:ascii="Times New Roman" w:eastAsia="Times New Roman" w:hAnsi="Times New Roman" w:cs="Times New Roman"/>
-          <w:kern w:val="0"/>
-          <w:sz w:val="24"/>
-          <w14:ligatures w14:val="none"/>
-        </w:rPr>
+      </w:pPr>
+      <w:r>
         <w:lastRenderedPageBreak/>
         <w:t xml:space="preserve">Read each sub's self-promo rule first. Most allow "I made this" posts </w:t>
       </w:r>
       <w:r>
         <w:rPr>
-          <w:rFonts w:ascii="Times New Roman" w:eastAsia="Times New Roman" w:hAnsi="Times New Roman" w:cs="Times New Roman"/>
           <w:i/>
           <w:iCs/>
-          <w:kern w:val="0"/>
-          <w:sz w:val="24"/>
-          <w14:ligatures w14:val="none"/>
         </w:rPr>
         <w:t>if you're a participating member</w:t>
       </w:r>
       <w:r>
-        <w:rPr>
-          <w:rFonts w:ascii="Times New Roman" w:eastAsia="Times New Roman" w:hAnsi="Times New Roman" w:cs="Times New Roman"/>
-          <w:kern w:val="0"/>
-          <w:sz w:val="24"/>
-          <w14:ligatures w14:val="none"/>
-        </w:rPr>
         <w:t>. Post 3–5 genuine comments in each sub the week before.</w:t>
       </w:r>
     </w:p>
@@ -1178,71 +664,33 @@
           <w:numId w:val="2"/>
         </w:numPr>
         <w:spacing w:before="100" w:beforeAutospacing="1" w:after="100" w:afterAutospacing="1"/>
-        <w:rPr>
-          <w:rFonts w:ascii="Times New Roman" w:eastAsia="Times New Roman" w:hAnsi="Times New Roman" w:cs="Times New Roman"/>
-          <w:kern w:val="0"/>
-          <w:sz w:val="24"/>
-          <w14:ligatures w14:val="none"/>
-        </w:rPr>
-      </w:pPr>
-      <w:r>
-        <w:rPr>
-          <w:rFonts w:ascii="Times New Roman" w:eastAsia="Times New Roman" w:hAnsi="Times New Roman" w:cs="Times New Roman"/>
-          <w:b/>
-          <w:bCs/>
-          <w:kern w:val="0"/>
-          <w:sz w:val="24"/>
-          <w14:ligatures w14:val="none"/>
+      </w:pPr>
+      <w:r>
+        <w:rPr>
+          <w:b/>
+          <w:bCs/>
         </w:rPr>
         <w:t>Lead with a story, not a pitch.</w:t>
       </w:r>
       <w:r>
-        <w:rPr>
-          <w:rFonts w:ascii="Times New Roman" w:eastAsia="Times New Roman" w:hAnsi="Times New Roman" w:cs="Times New Roman"/>
-          <w:kern w:val="0"/>
-          <w:sz w:val="24"/>
-          <w14:ligatures w14:val="none"/>
-        </w:rPr>
         <w:t xml:space="preserve"> "</w:t>
       </w:r>
       <w:bookmarkStart w:id="0" w:name="OLE_LINK1"/>
       <w:r>
-        <w:rPr>
-          <w:rFonts w:ascii="Times New Roman" w:eastAsia="Times New Roman" w:hAnsi="Times New Roman" w:cs="Times New Roman"/>
-          <w:kern w:val="0"/>
-          <w:sz w:val="24"/>
-          <w14:ligatures w14:val="none"/>
-        </w:rPr>
         <w:t>I'd visited 22 parks and couldn't remember which year I went to Acadia. So I built the thing I wanted</w:t>
       </w:r>
       <w:bookmarkEnd w:id="0"/>
       <w:r>
-        <w:rPr>
-          <w:rFonts w:ascii="Times New Roman" w:eastAsia="Times New Roman" w:hAnsi="Times New Roman" w:cs="Times New Roman"/>
-          <w:kern w:val="0"/>
-          <w:sz w:val="24"/>
-          <w14:ligatures w14:val="none"/>
-        </w:rPr>
         <w:t xml:space="preserve">." Screenshot of </w:t>
       </w:r>
       <w:r>
         <w:rPr>
-          <w:rFonts w:ascii="Times New Roman" w:eastAsia="Times New Roman" w:hAnsi="Times New Roman" w:cs="Times New Roman"/>
           <w:i/>
           <w:iCs/>
-          <w:kern w:val="0"/>
-          <w:sz w:val="24"/>
-          <w14:ligatures w14:val="none"/>
         </w:rPr>
         <w:t>your</w:t>
       </w:r>
       <w:r>
-        <w:rPr>
-          <w:rFonts w:ascii="Times New Roman" w:eastAsia="Times New Roman" w:hAnsi="Times New Roman" w:cs="Times New Roman"/>
-          <w:kern w:val="0"/>
-          <w:sz w:val="24"/>
-          <w14:ligatures w14:val="none"/>
-        </w:rPr>
         <w:t xml:space="preserve"> ring, not a marketing image.</w:t>
       </w:r>
     </w:p>
@@ -1253,20 +701,8 @@
           <w:numId w:val="2"/>
         </w:numPr>
         <w:spacing w:before="100" w:beforeAutospacing="1" w:after="100" w:afterAutospacing="1"/>
-        <w:rPr>
-          <w:rFonts w:ascii="Times New Roman" w:eastAsia="Times New Roman" w:hAnsi="Times New Roman" w:cs="Times New Roman"/>
-          <w:kern w:val="0"/>
-          <w:sz w:val="24"/>
-          <w14:ligatures w14:val="none"/>
-        </w:rPr>
-      </w:pPr>
-      <w:r>
-        <w:rPr>
-          <w:rFonts w:ascii="Times New Roman" w:eastAsia="Times New Roman" w:hAnsi="Times New Roman" w:cs="Times New Roman"/>
-          <w:kern w:val="0"/>
-          <w:sz w:val="24"/>
-          <w14:ligatures w14:val="none"/>
-        </w:rPr>
+      </w:pPr>
+      <w:r>
         <w:t>Put the link in a comment, not the post body.</w:t>
       </w:r>
     </w:p>
@@ -1277,20 +713,8 @@
           <w:numId w:val="2"/>
         </w:numPr>
         <w:spacing w:before="100" w:beforeAutospacing="1" w:after="100" w:afterAutospacing="1"/>
-        <w:rPr>
-          <w:rFonts w:ascii="Times New Roman" w:eastAsia="Times New Roman" w:hAnsi="Times New Roman" w:cs="Times New Roman"/>
-          <w:kern w:val="0"/>
-          <w:sz w:val="24"/>
-          <w14:ligatures w14:val="none"/>
-        </w:rPr>
-      </w:pPr>
-      <w:r>
-        <w:rPr>
-          <w:rFonts w:ascii="Times New Roman" w:eastAsia="Times New Roman" w:hAnsi="Times New Roman" w:cs="Times New Roman"/>
-          <w:kern w:val="0"/>
-          <w:sz w:val="24"/>
-          <w14:ligatures w14:val="none"/>
-        </w:rPr>
+      </w:pPr>
+      <w:r>
         <w:t>Reply to every comment for 6 hours. Reddit rewards engagement velocity.</w:t>
       </w:r>
     </w:p>
@@ -1301,61 +725,27 @@
           <w:numId w:val="2"/>
         </w:numPr>
         <w:spacing w:before="100" w:beforeAutospacing="1" w:after="100" w:afterAutospacing="1"/>
-        <w:rPr>
-          <w:rFonts w:ascii="Times New Roman" w:eastAsia="Times New Roman" w:hAnsi="Times New Roman" w:cs="Times New Roman"/>
-          <w:kern w:val="0"/>
-          <w:sz w:val="24"/>
-          <w14:ligatures w14:val="none"/>
-        </w:rPr>
-      </w:pPr>
-      <w:r>
-        <w:rPr>
-          <w:rFonts w:ascii="Times New Roman" w:eastAsia="Times New Roman" w:hAnsi="Times New Roman" w:cs="Times New Roman"/>
-          <w:kern w:val="0"/>
-          <w:sz w:val="24"/>
-          <w14:ligatures w14:val="none"/>
-        </w:rPr>
+      </w:pPr>
+      <w:r>
         <w:t>One sub per day — cross-posting the same day gets you flagged.</w:t>
       </w:r>
     </w:p>
     <w:p>
       <w:pPr>
         <w:spacing w:before="100" w:beforeAutospacing="1" w:after="100" w:afterAutospacing="1"/>
-        <w:rPr>
-          <w:rFonts w:ascii="Times New Roman" w:eastAsia="Times New Roman" w:hAnsi="Times New Roman" w:cs="Times New Roman"/>
-          <w:kern w:val="0"/>
-          <w:sz w:val="24"/>
-          <w14:ligatures w14:val="none"/>
-        </w:rPr>
-      </w:pPr>
-      <w:r>
-        <w:rPr>
-          <w:rFonts w:ascii="Times New Roman" w:eastAsia="Times New Roman" w:hAnsi="Times New Roman" w:cs="Times New Roman"/>
-          <w:kern w:val="0"/>
-          <w:sz w:val="24"/>
-          <w14:ligatures w14:val="none"/>
-        </w:rPr>
+      </w:pPr>
+      <w:r>
         <w:t>Realistic outcome: one post lands (500+ upvotes), two do fine (50–100), two die. The one that lands is ~300–500 installs.</w:t>
       </w:r>
     </w:p>
     <w:p>
       <w:pPr>
         <w:spacing w:before="100" w:beforeAutospacing="1" w:after="100" w:afterAutospacing="1"/>
-        <w:rPr>
-          <w:rFonts w:ascii="Times New Roman" w:eastAsia="Times New Roman" w:hAnsi="Times New Roman" w:cs="Times New Roman"/>
-          <w:kern w:val="0"/>
-          <w:sz w:val="24"/>
-          <w14:ligatures w14:val="none"/>
-        </w:rPr>
-      </w:pPr>
-      <w:r>
-        <w:rPr>
-          <w:rFonts w:ascii="Times New Roman" w:eastAsia="Times New Roman" w:hAnsi="Times New Roman" w:cs="Times New Roman"/>
-          <w:b/>
-          <w:bCs/>
-          <w:kern w:val="0"/>
-          <w:sz w:val="24"/>
-          <w14:ligatures w14:val="none"/>
+      </w:pPr>
+      <w:r>
+        <w:rPr>
+          <w:b/>
+          <w:bCs/>
         </w:rPr>
         <w:t>Facebook groups (don't skip — this is where the 50+ demographic lives, and they're the ones actually visiting all 63):</w:t>
       </w:r>
@@ -1367,20 +757,8 @@
           <w:numId w:val="3"/>
         </w:numPr>
         <w:spacing w:before="100" w:beforeAutospacing="1" w:after="100" w:afterAutospacing="1"/>
-        <w:rPr>
-          <w:rFonts w:ascii="Times New Roman" w:eastAsia="Times New Roman" w:hAnsi="Times New Roman" w:cs="Times New Roman"/>
-          <w:kern w:val="0"/>
-          <w:sz w:val="24"/>
-          <w14:ligatures w14:val="none"/>
-        </w:rPr>
-      </w:pPr>
-      <w:r>
-        <w:rPr>
-          <w:rFonts w:ascii="Times New Roman" w:eastAsia="Times New Roman" w:hAnsi="Times New Roman" w:cs="Times New Roman"/>
-          <w:kern w:val="0"/>
-          <w:sz w:val="24"/>
-          <w14:ligatures w14:val="none"/>
-        </w:rPr>
+      </w:pPr>
+      <w:r>
         <w:t>"National Park Passport Stamps," "National Parks Travelers," "All 63 National Parks" groups — several have 100k+ members.</w:t>
       </w:r>
     </w:p>
@@ -1391,70 +769,34 @@
           <w:numId w:val="3"/>
         </w:numPr>
         <w:spacing w:before="100" w:beforeAutospacing="1" w:after="100" w:afterAutospacing="1"/>
-        <w:rPr>
-          <w:rFonts w:ascii="Times New Roman" w:eastAsia="Times New Roman" w:hAnsi="Times New Roman" w:cs="Times New Roman"/>
-          <w:kern w:val="0"/>
-          <w:sz w:val="24"/>
-          <w14:ligatures w14:val="none"/>
-        </w:rPr>
-      </w:pPr>
-      <w:r>
-        <w:rPr>
-          <w:rFonts w:ascii="Times New Roman" w:eastAsia="Times New Roman" w:hAnsi="Times New Roman" w:cs="Times New Roman"/>
-          <w:kern w:val="0"/>
-          <w:sz w:val="24"/>
-          <w14:ligatures w14:val="none"/>
-        </w:rPr>
+      </w:pPr>
+      <w:r>
         <w:t>Same rules: participate first, story-first post, ask permission from mods if unsure.</w:t>
       </w:r>
     </w:p>
     <w:p>
       <w:pPr>
         <w:spacing w:before="100" w:beforeAutospacing="1" w:after="100" w:afterAutospacing="1"/>
-        <w:rPr>
-          <w:rFonts w:ascii="Times New Roman" w:eastAsia="Times New Roman" w:hAnsi="Times New Roman" w:cs="Times New Roman"/>
-          <w:kern w:val="0"/>
-          <w:sz w:val="24"/>
-          <w14:ligatures w14:val="none"/>
-        </w:rPr>
-      </w:pPr>
-      <w:r>
-        <w:rPr>
-          <w:rFonts w:ascii="Times New Roman" w:eastAsia="Times New Roman" w:hAnsi="Times New Roman" w:cs="Times New Roman"/>
-          <w:b/>
-          <w:bCs/>
-          <w:kern w:val="0"/>
-          <w:sz w:val="24"/>
-          <w14:ligatures w14:val="none"/>
+      </w:pPr>
+      <w:r>
+        <w:rPr>
+          <w:b/>
+          <w:bCs/>
         </w:rPr>
         <w:t>Product Hunt:</w:t>
       </w:r>
       <w:r>
-        <w:rPr>
-          <w:rFonts w:ascii="Times New Roman" w:eastAsia="Times New Roman" w:hAnsi="Times New Roman" w:cs="Times New Roman"/>
-          <w:kern w:val="0"/>
-          <w:sz w:val="24"/>
-          <w14:ligatures w14:val="none"/>
-        </w:rPr>
         <w:t xml:space="preserve"> launch it, but expect ~50 installs. It's for the backlink and the "Featured on PH" badge.</w:t>
       </w:r>
     </w:p>
     <w:p>
-      <w:pPr>
-        <w:rPr>
-          <w:rFonts w:ascii="Times New Roman" w:eastAsia="Times New Roman" w:hAnsi="Times New Roman" w:cs="Times New Roman"/>
-          <w:kern w:val="0"/>
-          <w:sz w:val="24"/>
-          <w14:ligatures w14:val="none"/>
-        </w:rPr>
-      </w:pPr>
       <w:r>
         <w:rPr>
           <w:noProof/>
         </w:rPr>
       </w:r>
       <w:r>
-        <w:pict w14:anchorId="323FCAB3">
+        <w:pict w14:anchorId="237EFE0F">
           <v:rect id="Horizontal Line 2" o:spid="_x0000_s1028" style="width:468pt;height:.1pt;visibility:visible;mso-wrap-style:square;mso-left-percent:-10001;mso-top-percent:-10001;mso-position-horizontal:absolute;mso-position-horizontal-relative:char;mso-position-vertical:absolute;mso-position-vertical-relative:line;mso-left-percent:-10001;mso-top-percent:-10001;v-text-anchor:top" o:gfxdata="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" filled="f">
             <o:lock v:ext="edit" rotation="t" aspectratio="t" verticies="t" text="t" shapetype="t"/>
             <w10:anchorlock/>
@@ -1467,24 +809,18 @@
         <w:spacing w:before="100" w:beforeAutospacing="1" w:after="100" w:afterAutospacing="1"/>
         <w:outlineLvl w:val="1"/>
         <w:rPr>
-          <w:rFonts w:ascii="Times New Roman" w:eastAsia="Times New Roman" w:hAnsi="Times New Roman" w:cs="Times New Roman"/>
-          <w:b/>
-          <w:bCs/>
-          <w:kern w:val="0"/>
+          <w:b/>
+          <w:bCs/>
           <w:sz w:val="36"/>
           <w:szCs w:val="36"/>
-          <w14:ligatures w14:val="none"/>
-        </w:rPr>
-      </w:pPr>
-      <w:r>
-        <w:rPr>
-          <w:rFonts w:ascii="Times New Roman" w:eastAsia="Times New Roman" w:hAnsi="Times New Roman" w:cs="Times New Roman"/>
-          <w:b/>
-          <w:bCs/>
-          <w:kern w:val="0"/>
+        </w:rPr>
+      </w:pPr>
+      <w:r>
+        <w:rPr>
+          <w:b/>
+          <w:bCs/>
           <w:sz w:val="36"/>
           <w:szCs w:val="36"/>
-          <w14:ligatures w14:val="none"/>
         </w:rPr>
         <w:t>Phase 2 — Content engine (weeks 2–6)</w:t>
       </w:r>
@@ -1492,51 +828,23 @@
     <w:p>
       <w:pPr>
         <w:spacing w:before="100" w:beforeAutospacing="1" w:after="100" w:afterAutospacing="1"/>
-        <w:rPr>
-          <w:rFonts w:ascii="Times New Roman" w:eastAsia="Times New Roman" w:hAnsi="Times New Roman" w:cs="Times New Roman"/>
-          <w:kern w:val="0"/>
-          <w:sz w:val="24"/>
-          <w14:ligatures w14:val="none"/>
-        </w:rPr>
-      </w:pPr>
-      <w:r>
-        <w:rPr>
-          <w:rFonts w:ascii="Times New Roman" w:eastAsia="Times New Roman" w:hAnsi="Times New Roman" w:cs="Times New Roman"/>
-          <w:kern w:val="0"/>
-          <w:sz w:val="24"/>
-          <w14:ligatures w14:val="none"/>
-        </w:rPr>
+      </w:pPr>
+      <w:r>
         <w:t>Reddit gets you the first 500. Short video gets you the rest, and it compounds.</w:t>
       </w:r>
     </w:p>
     <w:p>
       <w:pPr>
         <w:spacing w:before="100" w:beforeAutospacing="1" w:after="100" w:afterAutospacing="1"/>
-        <w:rPr>
-          <w:rFonts w:ascii="Times New Roman" w:eastAsia="Times New Roman" w:hAnsi="Times New Roman" w:cs="Times New Roman"/>
-          <w:kern w:val="0"/>
-          <w:sz w:val="24"/>
-          <w14:ligatures w14:val="none"/>
-        </w:rPr>
-      </w:pPr>
-      <w:r>
-        <w:rPr>
-          <w:rFonts w:ascii="Times New Roman" w:eastAsia="Times New Roman" w:hAnsi="Times New Roman" w:cs="Times New Roman"/>
-          <w:b/>
-          <w:bCs/>
-          <w:kern w:val="0"/>
-          <w:sz w:val="24"/>
-          <w14:ligatures w14:val="none"/>
+      </w:pPr>
+      <w:r>
+        <w:rPr>
+          <w:b/>
+          <w:bCs/>
         </w:rPr>
         <w:t>TikTok / Reels / YouTube Shorts — post the same video to all three, 3×/week.</w:t>
       </w:r>
       <w:r>
-        <w:rPr>
-          <w:rFonts w:ascii="Times New Roman" w:eastAsia="Times New Roman" w:hAnsi="Times New Roman" w:cs="Times New Roman"/>
-          <w:kern w:val="0"/>
-          <w:sz w:val="24"/>
-          <w14:ligatures w14:val="none"/>
-        </w:rPr>
         <w:t xml:space="preserve"> Parks content massively over-performs on TikTok; the algorithm surfaces niche interests well. Formats that work for apps like this:</w:t>
       </w:r>
     </w:p>
@@ -1547,32 +855,16 @@
           <w:numId w:val="4"/>
         </w:numPr>
         <w:spacing w:before="100" w:beforeAutospacing="1" w:after="100" w:afterAutospacing="1"/>
-        <w:rPr>
-          <w:rFonts w:ascii="Times New Roman" w:eastAsia="Times New Roman" w:hAnsi="Times New Roman" w:cs="Times New Roman"/>
-          <w:kern w:val="0"/>
-          <w:sz w:val="24"/>
-          <w14:ligatures w14:val="none"/>
-        </w:rPr>
       </w:pPr>
       <w:bookmarkStart w:id="1" w:name="OLE_LINK2"/>
       <w:r>
         <w:rPr>
-          <w:rFonts w:ascii="Times New Roman" w:eastAsia="Times New Roman" w:hAnsi="Times New Roman" w:cs="Times New Roman"/>
-          <w:b/>
-          <w:bCs/>
-          <w:kern w:val="0"/>
-          <w:sz w:val="24"/>
-          <w14:ligatures w14:val="none"/>
+          <w:b/>
+          <w:bCs/>
         </w:rPr>
         <w:t>"POV: you just logged your 15th national park"</w:t>
       </w:r>
       <w:r>
-        <w:rPr>
-          <w:rFonts w:ascii="Times New Roman" w:eastAsia="Times New Roman" w:hAnsi="Times New Roman" w:cs="Times New Roman"/>
-          <w:kern w:val="0"/>
-          <w:sz w:val="24"/>
-          <w14:ligatures w14:val="none"/>
-        </w:rPr>
         <w:t xml:space="preserve"> — screen recording of the confetti + rank-up. Trending audio. 7 seconds. This is your best asset and it costs nothing.</w:t>
       </w:r>
     </w:p>
@@ -1583,31 +875,15 @@
           <w:numId w:val="4"/>
         </w:numPr>
         <w:spacing w:before="100" w:beforeAutospacing="1" w:after="100" w:afterAutospacing="1"/>
-        <w:rPr>
-          <w:rFonts w:ascii="Times New Roman" w:eastAsia="Times New Roman" w:hAnsi="Times New Roman" w:cs="Times New Roman"/>
-          <w:kern w:val="0"/>
-          <w:sz w:val="24"/>
-          <w14:ligatures w14:val="none"/>
-        </w:rPr>
-      </w:pPr>
-      <w:r>
-        <w:rPr>
-          <w:rFonts w:ascii="Times New Roman" w:eastAsia="Times New Roman" w:hAnsi="Times New Roman" w:cs="Times New Roman"/>
-          <w:b/>
-          <w:bCs/>
-          <w:kern w:val="0"/>
-          <w:sz w:val="24"/>
-          <w14:ligatures w14:val="none"/>
+      </w:pPr>
+      <w:r>
+        <w:rPr>
+          <w:b/>
+          <w:bCs/>
         </w:rPr>
         <w:t>"Ranking all 63 national parks" series</w:t>
       </w:r>
       <w:r>
-        <w:rPr>
-          <w:rFonts w:ascii="Times New Roman" w:eastAsia="Times New Roman" w:hAnsi="Times New Roman" w:cs="Times New Roman"/>
-          <w:kern w:val="0"/>
-          <w:sz w:val="24"/>
-          <w14:ligatures w14:val="none"/>
-        </w:rPr>
         <w:t xml:space="preserve"> — one park per video, screen recording of that park's detail page + a real photo. 63 videos = 63 chances to go viral, each one searchable.</w:t>
       </w:r>
     </w:p>
@@ -1618,51 +894,25 @@
           <w:numId w:val="4"/>
         </w:numPr>
         <w:spacing w:before="100" w:beforeAutospacing="1" w:after="100" w:afterAutospacing="1"/>
-        <w:rPr>
-          <w:rFonts w:ascii="Times New Roman" w:eastAsia="Times New Roman" w:hAnsi="Times New Roman" w:cs="Times New Roman"/>
-          <w:kern w:val="0"/>
-          <w:sz w:val="24"/>
-          <w14:ligatures w14:val="none"/>
-        </w:rPr>
-      </w:pPr>
-      <w:r>
-        <w:rPr>
-          <w:rFonts w:ascii="Times New Roman" w:eastAsia="Times New Roman" w:hAnsi="Times New Roman" w:cs="Times New Roman"/>
-          <w:b/>
-          <w:bCs/>
-          <w:kern w:val="0"/>
-          <w:sz w:val="24"/>
-          <w14:ligatures w14:val="none"/>
+      </w:pPr>
+      <w:r>
+        <w:rPr>
+          <w:b/>
+          <w:bCs/>
         </w:rPr>
         <w:t>"How many national parks have you been to?"</w:t>
       </w:r>
       <w:r>
-        <w:rPr>
-          <w:rFonts w:ascii="Times New Roman" w:eastAsia="Times New Roman" w:hAnsi="Times New Roman" w:cs="Times New Roman"/>
-          <w:kern w:val="0"/>
-          <w:sz w:val="24"/>
-          <w14:ligatures w14:val="none"/>
-        </w:rPr>
         <w:t xml:space="preserve"> — show the ring at 5, 15, 30, 63. Comment bait: people </w:t>
       </w:r>
       <w:r>
         <w:rPr>
-          <w:rFonts w:ascii="Times New Roman" w:eastAsia="Times New Roman" w:hAnsi="Times New Roman" w:cs="Times New Roman"/>
           <w:i/>
           <w:iCs/>
-          <w:kern w:val="0"/>
-          <w:sz w:val="24"/>
-          <w14:ligatures w14:val="none"/>
         </w:rPr>
         <w:t>will</w:t>
       </w:r>
       <w:r>
-        <w:rPr>
-          <w:rFonts w:ascii="Times New Roman" w:eastAsia="Times New Roman" w:hAnsi="Times New Roman" w:cs="Times New Roman"/>
-          <w:kern w:val="0"/>
-          <w:sz w:val="24"/>
-          <w14:ligatures w14:val="none"/>
-        </w:rPr>
         <w:t xml:space="preserve"> reply with their number.</w:t>
       </w:r>
     </w:p>
@@ -1673,31 +923,15 @@
           <w:numId w:val="4"/>
         </w:numPr>
         <w:spacing w:before="100" w:beforeAutospacing="1" w:after="100" w:afterAutospacing="1"/>
-        <w:rPr>
-          <w:rFonts w:ascii="Times New Roman" w:eastAsia="Times New Roman" w:hAnsi="Times New Roman" w:cs="Times New Roman"/>
-          <w:kern w:val="0"/>
-          <w:sz w:val="24"/>
-          <w14:ligatures w14:val="none"/>
-        </w:rPr>
-      </w:pPr>
-      <w:r>
-        <w:rPr>
-          <w:rFonts w:ascii="Times New Roman" w:eastAsia="Times New Roman" w:hAnsi="Times New Roman" w:cs="Times New Roman"/>
-          <w:b/>
-          <w:bCs/>
-          <w:kern w:val="0"/>
-          <w:sz w:val="24"/>
-          <w14:ligatures w14:val="none"/>
+      </w:pPr>
+      <w:r>
+        <w:rPr>
+          <w:b/>
+          <w:bCs/>
         </w:rPr>
         <w:t>"Parks within 2 hours of [city]"</w:t>
       </w:r>
       <w:r>
-        <w:rPr>
-          <w:rFonts w:ascii="Times New Roman" w:eastAsia="Times New Roman" w:hAnsi="Times New Roman" w:cs="Times New Roman"/>
-          <w:kern w:val="0"/>
-          <w:sz w:val="24"/>
-          <w14:ligatures w14:val="none"/>
-        </w:rPr>
         <w:t xml:space="preserve"> — screen record the Nearby sheet from different simulator locations. Highly shareable locally.</w:t>
       </w:r>
     </w:p>
@@ -1709,124 +943,60 @@
           <w:numId w:val="4"/>
         </w:numPr>
         <w:spacing w:before="100" w:beforeAutospacing="1" w:after="100" w:afterAutospacing="1"/>
-        <w:rPr>
-          <w:rFonts w:ascii="Times New Roman" w:eastAsia="Times New Roman" w:hAnsi="Times New Roman" w:cs="Times New Roman"/>
-          <w:kern w:val="0"/>
-          <w:sz w:val="24"/>
-          <w14:ligatures w14:val="none"/>
-        </w:rPr>
-      </w:pPr>
-      <w:r>
-        <w:rPr>
-          <w:rFonts w:ascii="Times New Roman" w:eastAsia="Times New Roman" w:hAnsi="Times New Roman" w:cs="Times New Roman"/>
-          <w:kern w:val="0"/>
-          <w:sz w:val="24"/>
-          <w14:ligatures w14:val="none"/>
-        </w:rPr>
+      </w:pPr>
+      <w:r>
         <w:t>Stitch/reply to big parks creators' videos with "here's how I track mine."</w:t>
       </w:r>
     </w:p>
     <w:p>
       <w:pPr>
         <w:spacing w:before="100" w:beforeAutospacing="1" w:after="100" w:afterAutospacing="1"/>
-        <w:rPr>
-          <w:rFonts w:ascii="Times New Roman" w:eastAsia="Times New Roman" w:hAnsi="Times New Roman" w:cs="Times New Roman"/>
-          <w:kern w:val="0"/>
-          <w:sz w:val="24"/>
-          <w14:ligatures w14:val="none"/>
-        </w:rPr>
-      </w:pPr>
-      <w:r>
-        <w:rPr>
-          <w:rFonts w:ascii="Times New Roman" w:eastAsia="Times New Roman" w:hAnsi="Times New Roman" w:cs="Times New Roman"/>
-          <w:kern w:val="0"/>
-          <w:sz w:val="24"/>
-          <w14:ligatures w14:val="none"/>
-        </w:rPr>
+      </w:pPr>
+      <w:r>
         <w:t>Caption always ends with "free app in bio." Don't say the name in the first 2 seconds — hook first.</w:t>
       </w:r>
     </w:p>
     <w:p>
       <w:pPr>
         <w:spacing w:before="100" w:beforeAutospacing="1" w:after="100" w:afterAutospacing="1"/>
-        <w:rPr>
-          <w:rFonts w:ascii="Times New Roman" w:eastAsia="Times New Roman" w:hAnsi="Times New Roman" w:cs="Times New Roman"/>
-          <w:kern w:val="0"/>
-          <w:sz w:val="24"/>
-          <w14:ligatures w14:val="none"/>
-        </w:rPr>
-      </w:pPr>
-      <w:r>
-        <w:rPr>
-          <w:rFonts w:ascii="Times New Roman" w:eastAsia="Times New Roman" w:hAnsi="Times New Roman" w:cs="Times New Roman"/>
-          <w:b/>
-          <w:bCs/>
-          <w:kern w:val="0"/>
-          <w:sz w:val="24"/>
-          <w14:ligatures w14:val="none"/>
+      </w:pPr>
+      <w:r>
+        <w:rPr>
+          <w:b/>
+          <w:bCs/>
         </w:rPr>
         <w:lastRenderedPageBreak/>
         <w:t>Instagram specifically:</w:t>
       </w:r>
       <w:r>
-        <w:rPr>
-          <w:rFonts w:ascii="Times New Roman" w:eastAsia="Times New Roman" w:hAnsi="Times New Roman" w:cs="Times New Roman"/>
-          <w:kern w:val="0"/>
-          <w:sz w:val="24"/>
-          <w14:ligatures w14:val="none"/>
-        </w:rPr>
         <w:t xml:space="preserve"> Reels for reach, but the Stories share card loop is the real play. Ask in-app (a toast after a rank-up: "Share your new rank →") and reshare every tagged story to your account.</w:t>
       </w:r>
     </w:p>
     <w:p>
       <w:pPr>
         <w:spacing w:before="100" w:beforeAutospacing="1" w:after="100" w:afterAutospacing="1"/>
-        <w:rPr>
-          <w:rFonts w:ascii="Times New Roman" w:eastAsia="Times New Roman" w:hAnsi="Times New Roman" w:cs="Times New Roman"/>
-          <w:kern w:val="0"/>
-          <w:sz w:val="24"/>
-          <w14:ligatures w14:val="none"/>
-        </w:rPr>
       </w:pPr>
       <w:bookmarkStart w:id="2" w:name="OLE_LINK3"/>
       <w:r>
         <w:rPr>
-          <w:rFonts w:ascii="Times New Roman" w:eastAsia="Times New Roman" w:hAnsi="Times New Roman" w:cs="Times New Roman"/>
-          <w:b/>
-          <w:bCs/>
-          <w:kern w:val="0"/>
-          <w:sz w:val="24"/>
-          <w14:ligatures w14:val="none"/>
+          <w:b/>
+          <w:bCs/>
         </w:rPr>
         <w:t>Creator seeding:</w:t>
       </w:r>
       <w:r>
-        <w:rPr>
-          <w:rFonts w:ascii="Times New Roman" w:eastAsia="Times New Roman" w:hAnsi="Times New Roman" w:cs="Times New Roman"/>
-          <w:kern w:val="0"/>
-          <w:sz w:val="24"/>
-          <w14:ligatures w14:val="none"/>
-        </w:rPr>
         <w:t xml:space="preserve"> DM 20 mid-size parks creators (10k–100k followers) — the "we quit our jobs to visit all 63" couples, the passport-stamp collectors. Offer nothing but early access and a genuine ask for feedback. 2–3 will post organically. One of those is worth more than all your Reddit posts combined.</w:t>
       </w:r>
     </w:p>
     <w:bookmarkEnd w:id="2"/>
     <w:p>
-      <w:pPr>
-        <w:rPr>
-          <w:rFonts w:ascii="Times New Roman" w:eastAsia="Times New Roman" w:hAnsi="Times New Roman" w:cs="Times New Roman"/>
-          <w:kern w:val="0"/>
-          <w:sz w:val="24"/>
-          <w14:ligatures w14:val="none"/>
-        </w:rPr>
-      </w:pPr>
       <w:r>
         <w:rPr>
           <w:noProof/>
         </w:rPr>
       </w:r>
       <w:r>
-        <w:pict w14:anchorId="1C6651CA">
+        <w:pict w14:anchorId="1B439175">
           <v:rect id="Horizontal Line 3" o:spid="_x0000_s1027" style="width:468pt;height:.1pt;visibility:visible;mso-wrap-style:square;mso-left-percent:-10001;mso-top-percent:-10001;mso-position-horizontal:absolute;mso-position-horizontal-relative:char;mso-position-vertical:absolute;mso-position-vertical-relative:line;mso-left-percent:-10001;mso-top-percent:-10001;v-text-anchor:top" o:gfxdata="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" filled="f">
             <o:lock v:ext="edit" rotation="t" aspectratio="t" verticies="t" text="t" shapetype="t"/>
             <w10:anchorlock/>
@@ -1839,24 +1009,18 @@
         <w:spacing w:before="100" w:beforeAutospacing="1" w:after="100" w:afterAutospacing="1"/>
         <w:outlineLvl w:val="1"/>
         <w:rPr>
-          <w:rFonts w:ascii="Times New Roman" w:eastAsia="Times New Roman" w:hAnsi="Times New Roman" w:cs="Times New Roman"/>
-          <w:b/>
-          <w:bCs/>
-          <w:kern w:val="0"/>
+          <w:b/>
+          <w:bCs/>
           <w:sz w:val="36"/>
           <w:szCs w:val="36"/>
-          <w14:ligatures w14:val="none"/>
-        </w:rPr>
-      </w:pPr>
-      <w:r>
-        <w:rPr>
-          <w:rFonts w:ascii="Times New Roman" w:eastAsia="Times New Roman" w:hAnsi="Times New Roman" w:cs="Times New Roman"/>
-          <w:b/>
-          <w:bCs/>
-          <w:kern w:val="0"/>
+        </w:rPr>
+      </w:pPr>
+      <w:r>
+        <w:rPr>
+          <w:b/>
+          <w:bCs/>
           <w:sz w:val="36"/>
           <w:szCs w:val="36"/>
-          <w14:ligatures w14:val="none"/>
         </w:rPr>
         <w:t>Phase 3 — Compounding (ongoing)</w:t>
       </w:r>
@@ -1868,31 +1032,15 @@
           <w:numId w:val="5"/>
         </w:numPr>
         <w:spacing w:before="100" w:beforeAutospacing="1" w:after="100" w:afterAutospacing="1"/>
-        <w:rPr>
-          <w:rFonts w:ascii="Times New Roman" w:eastAsia="Times New Roman" w:hAnsi="Times New Roman" w:cs="Times New Roman"/>
-          <w:kern w:val="0"/>
-          <w:sz w:val="24"/>
-          <w14:ligatures w14:val="none"/>
-        </w:rPr>
-      </w:pPr>
-      <w:r>
-        <w:rPr>
-          <w:rFonts w:ascii="Times New Roman" w:eastAsia="Times New Roman" w:hAnsi="Times New Roman" w:cs="Times New Roman"/>
-          <w:b/>
-          <w:bCs/>
-          <w:kern w:val="0"/>
-          <w:sz w:val="24"/>
-          <w14:ligatures w14:val="none"/>
+      </w:pPr>
+      <w:r>
+        <w:rPr>
+          <w:b/>
+          <w:bCs/>
         </w:rPr>
         <w:t>Ship something visible every 2–3 weeks</w:t>
       </w:r>
       <w:r>
-        <w:rPr>
-          <w:rFonts w:ascii="Times New Roman" w:eastAsia="Times New Roman" w:hAnsi="Times New Roman" w:cs="Times New Roman"/>
-          <w:kern w:val="0"/>
-          <w:sz w:val="24"/>
-          <w14:ligatures w14:val="none"/>
-        </w:rPr>
         <w:t xml:space="preserve"> and post about it. Each release is a Reddit/TikTok excuse. Pro launch, poster, state parks, Android — each is a launch.</w:t>
       </w:r>
     </w:p>
@@ -1903,31 +1051,15 @@
           <w:numId w:val="5"/>
         </w:numPr>
         <w:spacing w:before="100" w:beforeAutospacing="1" w:after="100" w:afterAutospacing="1"/>
-        <w:rPr>
-          <w:rFonts w:ascii="Times New Roman" w:eastAsia="Times New Roman" w:hAnsi="Times New Roman" w:cs="Times New Roman"/>
-          <w:kern w:val="0"/>
-          <w:sz w:val="24"/>
-          <w14:ligatures w14:val="none"/>
-        </w:rPr>
-      </w:pPr>
-      <w:r>
-        <w:rPr>
-          <w:rFonts w:ascii="Times New Roman" w:eastAsia="Times New Roman" w:hAnsi="Times New Roman" w:cs="Times New Roman"/>
-          <w:b/>
-          <w:bCs/>
-          <w:kern w:val="0"/>
-          <w:sz w:val="24"/>
-          <w14:ligatures w14:val="none"/>
+      </w:pPr>
+      <w:r>
+        <w:rPr>
+          <w:b/>
+          <w:bCs/>
         </w:rPr>
         <w:t>Reply to every App Store review</w:t>
       </w:r>
       <w:r>
-        <w:rPr>
-          <w:rFonts w:ascii="Times New Roman" w:eastAsia="Times New Roman" w:hAnsi="Times New Roman" w:cs="Times New Roman"/>
-          <w:kern w:val="0"/>
-          <w:sz w:val="24"/>
-          <w14:ligatures w14:val="none"/>
-        </w:rPr>
         <w:t xml:space="preserve"> — it's visible and it shows you're alive.</w:t>
       </w:r>
     </w:p>
@@ -1938,31 +1070,15 @@
           <w:numId w:val="5"/>
         </w:numPr>
         <w:spacing w:before="100" w:beforeAutospacing="1" w:after="100" w:afterAutospacing="1"/>
-        <w:rPr>
-          <w:rFonts w:ascii="Times New Roman" w:eastAsia="Times New Roman" w:hAnsi="Times New Roman" w:cs="Times New Roman"/>
-          <w:kern w:val="0"/>
-          <w:sz w:val="24"/>
-          <w14:ligatures w14:val="none"/>
-        </w:rPr>
-      </w:pPr>
-      <w:r>
-        <w:rPr>
-          <w:rFonts w:ascii="Times New Roman" w:eastAsia="Times New Roman" w:hAnsi="Times New Roman" w:cs="Times New Roman"/>
-          <w:b/>
-          <w:bCs/>
-          <w:kern w:val="0"/>
-          <w:sz w:val="24"/>
-          <w14:ligatures w14:val="none"/>
+      </w:pPr>
+      <w:r>
+        <w:rPr>
+          <w:b/>
+          <w:bCs/>
         </w:rPr>
         <w:t>Newsletter capture</w:t>
       </w:r>
       <w:r>
-        <w:rPr>
-          <w:rFonts w:ascii="Times New Roman" w:eastAsia="Times New Roman" w:hAnsi="Times New Roman" w:cs="Times New Roman"/>
-          <w:kern w:val="0"/>
-          <w:sz w:val="24"/>
-          <w14:ligatures w14:val="none"/>
-        </w:rPr>
         <w:t xml:space="preserve"> — a "63 parks checklist" PDF in exchange for email on a simple landing page. Owned audience for when you launch Pro/posters.</w:t>
       </w:r>
     </w:p>
@@ -1973,31 +1089,15 @@
           <w:numId w:val="5"/>
         </w:numPr>
         <w:spacing w:before="100" w:beforeAutospacing="1" w:after="100" w:afterAutospacing="1"/>
-        <w:rPr>
-          <w:rFonts w:ascii="Times New Roman" w:eastAsia="Times New Roman" w:hAnsi="Times New Roman" w:cs="Times New Roman"/>
-          <w:kern w:val="0"/>
-          <w:sz w:val="24"/>
-          <w14:ligatures w14:val="none"/>
-        </w:rPr>
-      </w:pPr>
-      <w:r>
-        <w:rPr>
-          <w:rFonts w:ascii="Times New Roman" w:eastAsia="Times New Roman" w:hAnsi="Times New Roman" w:cs="Times New Roman"/>
-          <w:b/>
-          <w:bCs/>
-          <w:kern w:val="0"/>
-          <w:sz w:val="24"/>
-          <w14:ligatures w14:val="none"/>
+      </w:pPr>
+      <w:r>
+        <w:rPr>
+          <w:b/>
+          <w:bCs/>
         </w:rPr>
         <w:t>Seasonal hooks:</w:t>
       </w:r>
       <w:r>
-        <w:rPr>
-          <w:rFonts w:ascii="Times New Roman" w:eastAsia="Times New Roman" w:hAnsi="Times New Roman" w:cs="Times New Roman"/>
-          <w:kern w:val="0"/>
-          <w:sz w:val="24"/>
-          <w14:ligatures w14:val="none"/>
-        </w:rPr>
         <w:t xml:space="preserve"> fall foliage (now — Acadia, Smokies, Shenandoah), National Park Week (April, free entry days), summer road-trip planning (May). Time content to these.</w:t>
       </w:r>
     </w:p>
@@ -2008,50 +1108,26 @@
           <w:numId w:val="5"/>
         </w:numPr>
         <w:spacing w:before="100" w:beforeAutospacing="1" w:after="100" w:afterAutospacing="1"/>
-        <w:rPr>
-          <w:rFonts w:ascii="Times New Roman" w:eastAsia="Times New Roman" w:hAnsi="Times New Roman" w:cs="Times New Roman"/>
-          <w:kern w:val="0"/>
-          <w:sz w:val="24"/>
-          <w14:ligatures w14:val="none"/>
-        </w:rPr>
-      </w:pPr>
-      <w:r>
-        <w:rPr>
-          <w:rFonts w:ascii="Times New Roman" w:eastAsia="Times New Roman" w:hAnsi="Times New Roman" w:cs="Times New Roman"/>
-          <w:b/>
-          <w:bCs/>
-          <w:kern w:val="0"/>
-          <w:sz w:val="24"/>
-          <w14:ligatures w14:val="none"/>
+      </w:pPr>
+      <w:r>
+        <w:rPr>
+          <w:b/>
+          <w:bCs/>
         </w:rPr>
         <w:t>ASO loop:</w:t>
       </w:r>
       <w:r>
-        <w:rPr>
-          <w:rFonts w:ascii="Times New Roman" w:eastAsia="Times New Roman" w:hAnsi="Times New Roman" w:cs="Times New Roman"/>
-          <w:kern w:val="0"/>
-          <w:sz w:val="24"/>
-          <w14:ligatures w14:val="none"/>
-        </w:rPr>
         <w:t xml:space="preserve"> check App Store Connect → Analytics weekly. Which keywords bring impressions? Rewrite the subtitle toward whatever's working.</w:t>
       </w:r>
     </w:p>
     <w:p>
-      <w:pPr>
-        <w:rPr>
-          <w:rFonts w:ascii="Times New Roman" w:eastAsia="Times New Roman" w:hAnsi="Times New Roman" w:cs="Times New Roman"/>
-          <w:kern w:val="0"/>
-          <w:sz w:val="24"/>
-          <w14:ligatures w14:val="none"/>
-        </w:rPr>
-      </w:pPr>
       <w:r>
         <w:rPr>
           <w:noProof/>
         </w:rPr>
       </w:r>
       <w:r>
-        <w:pict w14:anchorId="4A286339">
+        <w:pict w14:anchorId="5FB75FD2">
           <v:rect id="Horizontal Line 4" o:spid="_x0000_s1026" style="width:468pt;height:.1pt;visibility:visible;mso-wrap-style:square;mso-left-percent:-10001;mso-top-percent:-10001;mso-position-horizontal:absolute;mso-position-horizontal-relative:char;mso-position-vertical:absolute;mso-position-vertical-relative:line;mso-left-percent:-10001;mso-top-percent:-10001;v-text-anchor:top" o:gfxdata="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" filled="f">
             <o:lock v:ext="edit" rotation="t" aspectratio="t" verticies="t" text="t" shapetype="t"/>
             <w10:anchorlock/>
@@ -2064,24 +1140,18 @@
         <w:spacing w:before="100" w:beforeAutospacing="1" w:after="100" w:afterAutospacing="1"/>
         <w:outlineLvl w:val="1"/>
         <w:rPr>
-          <w:rFonts w:ascii="Times New Roman" w:eastAsia="Times New Roman" w:hAnsi="Times New Roman" w:cs="Times New Roman"/>
-          <w:b/>
-          <w:bCs/>
-          <w:kern w:val="0"/>
+          <w:b/>
+          <w:bCs/>
           <w:sz w:val="36"/>
           <w:szCs w:val="36"/>
-          <w14:ligatures w14:val="none"/>
-        </w:rPr>
-      </w:pPr>
-      <w:r>
-        <w:rPr>
-          <w:rFonts w:ascii="Times New Roman" w:eastAsia="Times New Roman" w:hAnsi="Times New Roman" w:cs="Times New Roman"/>
-          <w:b/>
-          <w:bCs/>
-          <w:kern w:val="0"/>
+        </w:rPr>
+      </w:pPr>
+      <w:r>
+        <w:rPr>
+          <w:b/>
+          <w:bCs/>
           <w:sz w:val="36"/>
           <w:szCs w:val="36"/>
-          <w14:ligatures w14:val="none"/>
         </w:rPr>
         <w:t>The honest math</w:t>
       </w:r>
@@ -2118,22 +1188,14 @@
             <w:pPr>
               <w:jc w:val="center"/>
               <w:rPr>
-                <w:rFonts w:ascii="Times New Roman" w:eastAsia="Times New Roman" w:hAnsi="Times New Roman" w:cs="Times New Roman"/>
                 <w:b/>
                 <w:bCs/>
-                <w:kern w:val="0"/>
-                <w:sz w:val="24"/>
-                <w14:ligatures w14:val="none"/>
               </w:rPr>
             </w:pPr>
             <w:r>
               <w:rPr>
-                <w:rFonts w:ascii="Times New Roman" w:eastAsia="Times New Roman" w:hAnsi="Times New Roman" w:cs="Times New Roman"/>
                 <w:b/>
                 <w:bCs/>
-                <w:kern w:val="0"/>
-                <w:sz w:val="24"/>
-                <w14:ligatures w14:val="none"/>
               </w:rPr>
               <w:t>Channel</w:t>
             </w:r>
@@ -2149,22 +1211,14 @@
             <w:pPr>
               <w:jc w:val="center"/>
               <w:rPr>
-                <w:rFonts w:ascii="Times New Roman" w:eastAsia="Times New Roman" w:hAnsi="Times New Roman" w:cs="Times New Roman"/>
                 <w:b/>
                 <w:bCs/>
-                <w:kern w:val="0"/>
-                <w:sz w:val="24"/>
-                <w14:ligatures w14:val="none"/>
               </w:rPr>
             </w:pPr>
             <w:r>
               <w:rPr>
-                <w:rFonts w:ascii="Times New Roman" w:eastAsia="Times New Roman" w:hAnsi="Times New Roman" w:cs="Times New Roman"/>
                 <w:b/>
                 <w:bCs/>
-                <w:kern w:val="0"/>
-                <w:sz w:val="24"/>
-                <w14:ligatures w14:val="none"/>
               </w:rPr>
               <w:t>Effort</w:t>
             </w:r>
@@ -2180,22 +1234,14 @@
             <w:pPr>
               <w:jc w:val="center"/>
               <w:rPr>
-                <w:rFonts w:ascii="Times New Roman" w:eastAsia="Times New Roman" w:hAnsi="Times New Roman" w:cs="Times New Roman"/>
                 <w:b/>
                 <w:bCs/>
-                <w:kern w:val="0"/>
-                <w:sz w:val="24"/>
-                <w14:ligatures w14:val="none"/>
               </w:rPr>
             </w:pPr>
             <w:r>
               <w:rPr>
-                <w:rFonts w:ascii="Times New Roman" w:eastAsia="Times New Roman" w:hAnsi="Times New Roman" w:cs="Times New Roman"/>
                 <w:b/>
                 <w:bCs/>
-                <w:kern w:val="0"/>
-                <w:sz w:val="24"/>
-                <w14:ligatures w14:val="none"/>
               </w:rPr>
               <w:t>Expected installs</w:t>
             </w:r>
@@ -2213,21 +1259,7 @@
             <w:hideMark/>
           </w:tcPr>
           <w:p>
-            <w:pPr>
-              <w:rPr>
-                <w:rFonts w:ascii="Times New Roman" w:eastAsia="Times New Roman" w:hAnsi="Times New Roman" w:cs="Times New Roman"/>
-                <w:kern w:val="0"/>
-                <w:sz w:val="24"/>
-                <w14:ligatures w14:val="none"/>
-              </w:rPr>
-            </w:pPr>
-            <w:r>
-              <w:rPr>
-                <w:rFonts w:ascii="Times New Roman" w:eastAsia="Times New Roman" w:hAnsi="Times New Roman" w:cs="Times New Roman"/>
-                <w:kern w:val="0"/>
-                <w:sz w:val="24"/>
-                <w14:ligatures w14:val="none"/>
-              </w:rPr>
+            <w:r>
               <w:t>5 Reddit posts</w:t>
             </w:r>
           </w:p>
@@ -2239,21 +1271,7 @@
             <w:hideMark/>
           </w:tcPr>
           <w:p>
-            <w:pPr>
-              <w:rPr>
-                <w:rFonts w:ascii="Times New Roman" w:eastAsia="Times New Roman" w:hAnsi="Times New Roman" w:cs="Times New Roman"/>
-                <w:kern w:val="0"/>
-                <w:sz w:val="24"/>
-                <w14:ligatures w14:val="none"/>
-              </w:rPr>
-            </w:pPr>
-            <w:r>
-              <w:rPr>
-                <w:rFonts w:ascii="Times New Roman" w:eastAsia="Times New Roman" w:hAnsi="Times New Roman" w:cs="Times New Roman"/>
-                <w:kern w:val="0"/>
-                <w:sz w:val="24"/>
-                <w14:ligatures w14:val="none"/>
-              </w:rPr>
+            <w:r>
               <w:t>1 week</w:t>
             </w:r>
           </w:p>
@@ -2265,21 +1283,7 @@
             <w:hideMark/>
           </w:tcPr>
           <w:p>
-            <w:pPr>
-              <w:rPr>
-                <w:rFonts w:ascii="Times New Roman" w:eastAsia="Times New Roman" w:hAnsi="Times New Roman" w:cs="Times New Roman"/>
-                <w:kern w:val="0"/>
-                <w:sz w:val="24"/>
-                <w14:ligatures w14:val="none"/>
-              </w:rPr>
-            </w:pPr>
-            <w:r>
-              <w:rPr>
-                <w:rFonts w:ascii="Times New Roman" w:eastAsia="Times New Roman" w:hAnsi="Times New Roman" w:cs="Times New Roman"/>
-                <w:kern w:val="0"/>
-                <w:sz w:val="24"/>
-                <w14:ligatures w14:val="none"/>
-              </w:rPr>
+            <w:r>
               <w:t>400–700</w:t>
             </w:r>
           </w:p>
@@ -2296,21 +1300,7 @@
             <w:hideMark/>
           </w:tcPr>
           <w:p>
-            <w:pPr>
-              <w:rPr>
-                <w:rFonts w:ascii="Times New Roman" w:eastAsia="Times New Roman" w:hAnsi="Times New Roman" w:cs="Times New Roman"/>
-                <w:kern w:val="0"/>
-                <w:sz w:val="24"/>
-                <w14:ligatures w14:val="none"/>
-              </w:rPr>
-            </w:pPr>
-            <w:r>
-              <w:rPr>
-                <w:rFonts w:ascii="Times New Roman" w:eastAsia="Times New Roman" w:hAnsi="Times New Roman" w:cs="Times New Roman"/>
-                <w:kern w:val="0"/>
-                <w:sz w:val="24"/>
-                <w14:ligatures w14:val="none"/>
-              </w:rPr>
+            <w:r>
               <w:t>3 Facebook groups</w:t>
             </w:r>
           </w:p>
@@ -2322,21 +1312,7 @@
             <w:hideMark/>
           </w:tcPr>
           <w:p>
-            <w:pPr>
-              <w:rPr>
-                <w:rFonts w:ascii="Times New Roman" w:eastAsia="Times New Roman" w:hAnsi="Times New Roman" w:cs="Times New Roman"/>
-                <w:kern w:val="0"/>
-                <w:sz w:val="24"/>
-                <w14:ligatures w14:val="none"/>
-              </w:rPr>
-            </w:pPr>
-            <w:r>
-              <w:rPr>
-                <w:rFonts w:ascii="Times New Roman" w:eastAsia="Times New Roman" w:hAnsi="Times New Roman" w:cs="Times New Roman"/>
-                <w:kern w:val="0"/>
-                <w:sz w:val="24"/>
-                <w14:ligatures w14:val="none"/>
-              </w:rPr>
+            <w:r>
               <w:t>2 hours</w:t>
             </w:r>
           </w:p>
@@ -2348,21 +1324,7 @@
             <w:hideMark/>
           </w:tcPr>
           <w:p>
-            <w:pPr>
-              <w:rPr>
-                <w:rFonts w:ascii="Times New Roman" w:eastAsia="Times New Roman" w:hAnsi="Times New Roman" w:cs="Times New Roman"/>
-                <w:kern w:val="0"/>
-                <w:sz w:val="24"/>
-                <w14:ligatures w14:val="none"/>
-              </w:rPr>
-            </w:pPr>
-            <w:r>
-              <w:rPr>
-                <w:rFonts w:ascii="Times New Roman" w:eastAsia="Times New Roman" w:hAnsi="Times New Roman" w:cs="Times New Roman"/>
-                <w:kern w:val="0"/>
-                <w:sz w:val="24"/>
-                <w14:ligatures w14:val="none"/>
-              </w:rPr>
+            <w:r>
               <w:t>100–200</w:t>
             </w:r>
           </w:p>
@@ -2379,21 +1341,7 @@
             <w:hideMark/>
           </w:tcPr>
           <w:p>
-            <w:pPr>
-              <w:rPr>
-                <w:rFonts w:ascii="Times New Roman" w:eastAsia="Times New Roman" w:hAnsi="Times New Roman" w:cs="Times New Roman"/>
-                <w:kern w:val="0"/>
-                <w:sz w:val="24"/>
-                <w14:ligatures w14:val="none"/>
-              </w:rPr>
-            </w:pPr>
-            <w:r>
-              <w:rPr>
-                <w:rFonts w:ascii="Times New Roman" w:eastAsia="Times New Roman" w:hAnsi="Times New Roman" w:cs="Times New Roman"/>
-                <w:kern w:val="0"/>
-                <w:sz w:val="24"/>
-                <w14:ligatures w14:val="none"/>
-              </w:rPr>
+            <w:r>
               <w:t>Product Hunt</w:t>
             </w:r>
           </w:p>
@@ -2405,21 +1353,7 @@
             <w:hideMark/>
           </w:tcPr>
           <w:p>
-            <w:pPr>
-              <w:rPr>
-                <w:rFonts w:ascii="Times New Roman" w:eastAsia="Times New Roman" w:hAnsi="Times New Roman" w:cs="Times New Roman"/>
-                <w:kern w:val="0"/>
-                <w:sz w:val="24"/>
-                <w14:ligatures w14:val="none"/>
-              </w:rPr>
-            </w:pPr>
-            <w:r>
-              <w:rPr>
-                <w:rFonts w:ascii="Times New Roman" w:eastAsia="Times New Roman" w:hAnsi="Times New Roman" w:cs="Times New Roman"/>
-                <w:kern w:val="0"/>
-                <w:sz w:val="24"/>
-                <w14:ligatures w14:val="none"/>
-              </w:rPr>
+            <w:r>
               <w:t>2 hours</w:t>
             </w:r>
           </w:p>
@@ -2431,21 +1365,7 @@
             <w:hideMark/>
           </w:tcPr>
           <w:p>
-            <w:pPr>
-              <w:rPr>
-                <w:rFonts w:ascii="Times New Roman" w:eastAsia="Times New Roman" w:hAnsi="Times New Roman" w:cs="Times New Roman"/>
-                <w:kern w:val="0"/>
-                <w:sz w:val="24"/>
-                <w14:ligatures w14:val="none"/>
-              </w:rPr>
-            </w:pPr>
-            <w:r>
-              <w:rPr>
-                <w:rFonts w:ascii="Times New Roman" w:eastAsia="Times New Roman" w:hAnsi="Times New Roman" w:cs="Times New Roman"/>
-                <w:kern w:val="0"/>
-                <w:sz w:val="24"/>
-                <w14:ligatures w14:val="none"/>
-              </w:rPr>
+            <w:r>
               <w:t>50</w:t>
             </w:r>
           </w:p>
@@ -2462,21 +1382,7 @@
             <w:hideMark/>
           </w:tcPr>
           <w:p>
-            <w:pPr>
-              <w:rPr>
-                <w:rFonts w:ascii="Times New Roman" w:eastAsia="Times New Roman" w:hAnsi="Times New Roman" w:cs="Times New Roman"/>
-                <w:kern w:val="0"/>
-                <w:sz w:val="24"/>
-                <w14:ligatures w14:val="none"/>
-              </w:rPr>
-            </w:pPr>
-            <w:r>
-              <w:rPr>
-                <w:rFonts w:ascii="Times New Roman" w:eastAsia="Times New Roman" w:hAnsi="Times New Roman" w:cs="Times New Roman"/>
-                <w:kern w:val="0"/>
-                <w:sz w:val="24"/>
-                <w14:ligatures w14:val="none"/>
-              </w:rPr>
+            <w:r>
               <w:t>20 TikToks</w:t>
             </w:r>
           </w:p>
@@ -2488,21 +1394,7 @@
             <w:hideMark/>
           </w:tcPr>
           <w:p>
-            <w:pPr>
-              <w:rPr>
-                <w:rFonts w:ascii="Times New Roman" w:eastAsia="Times New Roman" w:hAnsi="Times New Roman" w:cs="Times New Roman"/>
-                <w:kern w:val="0"/>
-                <w:sz w:val="24"/>
-                <w14:ligatures w14:val="none"/>
-              </w:rPr>
-            </w:pPr>
-            <w:r>
-              <w:rPr>
-                <w:rFonts w:ascii="Times New Roman" w:eastAsia="Times New Roman" w:hAnsi="Times New Roman" w:cs="Times New Roman"/>
-                <w:kern w:val="0"/>
-                <w:sz w:val="24"/>
-                <w14:ligatures w14:val="none"/>
-              </w:rPr>
+            <w:r>
               <w:t>6 weeks</w:t>
             </w:r>
           </w:p>
@@ -2514,21 +1406,7 @@
             <w:hideMark/>
           </w:tcPr>
           <w:p>
-            <w:pPr>
-              <w:rPr>
-                <w:rFonts w:ascii="Times New Roman" w:eastAsia="Times New Roman" w:hAnsi="Times New Roman" w:cs="Times New Roman"/>
-                <w:kern w:val="0"/>
-                <w:sz w:val="24"/>
-                <w14:ligatures w14:val="none"/>
-              </w:rPr>
-            </w:pPr>
-            <w:r>
-              <w:rPr>
-                <w:rFonts w:ascii="Times New Roman" w:eastAsia="Times New Roman" w:hAnsi="Times New Roman" w:cs="Times New Roman"/>
-                <w:kern w:val="0"/>
-                <w:sz w:val="24"/>
-                <w14:ligatures w14:val="none"/>
-              </w:rPr>
+            <w:r>
               <w:t>200–2,000 (high variance)</w:t>
             </w:r>
           </w:p>
@@ -2545,22 +1423,375 @@
             <w:hideMark/>
           </w:tcPr>
           <w:p>
+            <w:r>
+              <w:t>2 creator posts</w:t>
+            </w:r>
+          </w:p>
+        </w:tc>
+        <w:tc>
+          <w:tcPr>
+            <w:tcW w:w="0" w:type="auto"/>
+            <w:vAlign w:val="center"/>
+            <w:hideMark/>
+          </w:tcPr>
+          <w:p>
+            <w:r>
+              <w:t>luck + DMs</w:t>
+            </w:r>
+          </w:p>
+        </w:tc>
+        <w:tc>
+          <w:tcPr>
+            <w:tcW w:w="0" w:type="auto"/>
+            <w:vAlign w:val="center"/>
+            <w:hideMark/>
+          </w:tcPr>
+          <w:p>
+            <w:r>
+              <w:t>200–1,000</w:t>
+            </w:r>
+          </w:p>
+        </w:tc>
+      </w:tr>
+    </w:tbl>
+    <w:p>
+      <w:pPr>
+        <w:spacing w:before="100" w:beforeAutospacing="1" w:after="100" w:afterAutospacing="1"/>
+      </w:pPr>
+      <w:r>
+        <w:t>You cross 1,000 on Reddit + Facebook alone if two posts land. Video is what gets you to 10k.</w:t>
+      </w:r>
+    </w:p>
+    <w:p>
+      <w:pPr>
+        <w:spacing w:before="100" w:beforeAutospacing="1" w:after="100" w:afterAutospacing="1"/>
+      </w:pPr>
+      <w:r>
+        <w:rPr>
+          <w:b/>
+          <w:bCs/>
+        </w:rPr>
+        <w:t>Followers</w:t>
+      </w:r>
+      <w:r>
+        <w:t xml:space="preserve"> follow downloads, not the other way around — don't optimize for them. 1k installs at a 5% follow rate is 50 followers; that's normal. The TikTok series is what builds the follower base, and it only matters as a distribution channel for Pro later.</w:t>
+      </w:r>
+    </w:p>
+    <w:p/>
+    <w:p>
+      <w:r>
+        <w:t>Updated todo list</w:t>
+      </w:r>
+    </w:p>
+    <w:p/>
+    <w:p>
+      <w:r>
+        <w:t>## Next steps</w:t>
+      </w:r>
+    </w:p>
+    <w:p/>
+    <w:p>
+      <w:r>
+        <w:t>**Ship 2.0 (today/tomorrow)**</w:t>
+      </w:r>
+    </w:p>
+    <w:p>
+      <w:r>
+        <w:t>1. App Store Connect → ParkAtlas → 2.0: once build **38** finishes processing, select it under *Build*.</w:t>
+      </w:r>
+    </w:p>
+    <w:p>
+      <w:r>
+        <w:t>2. Media: 6.9" → drop `app-preview-6.9.mp4` + the six PNGs from `upload-assets-2.0-overlay`; iPad 13" → the six from `upload-assets-ipad-2.0-overlay`.</w:t>
+      </w:r>
+    </w:p>
+    <w:p>
+      <w:r>
+        <w:t>3. What's New + description (copy from earlier), then **Add for Review → Submit**.</w:t>
+      </w:r>
+    </w:p>
+    <w:p>
+      <w:r>
+        <w:t>4. After approval: open `https://parkatlas.io/invite/test` on your phone to confirm universal links launch the app.</w:t>
+      </w:r>
+    </w:p>
+    <w:p/>
+    <w:p>
+      <w:r>
+        <w:t>**Site / growth plumbing (this week)**</w:t>
+      </w:r>
+    </w:p>
+    <w:p>
+      <w:r>
+        <w:t>5. Buttondown: rename newsletter to "ParkAtlas", set the welcome email to include the checklist PDF link.</w:t>
+      </w:r>
+    </w:p>
+    <w:p>
+      <w:r>
+        <w:t>6. Email: decide M365 vs. GoDaddy forwarding for [hello@parkatlas.io](mailto:hello@parkatlas.io), then fix the SPF record to match. Until then support mail may bounce.</w:t>
+      </w:r>
+    </w:p>
+    <w:p>
+      <w:r>
+        <w:t>7. Google Search Console: add the TXT record, verify parkatlas.io, submit `https://parkatlas.io/sitemap.xml` (66 URLs).</w:t>
+      </w:r>
+    </w:p>
+    <w:p>
+      <w:r>
+        <w:t>8. Content: run `record-batch.sh` for the Reels/TikTok library and start the week</w:t>
+      </w:r>
+      <w:r>
+        <w:rPr>
+          <w:rFonts w:ascii="Cambria Math" w:hAnsi="Cambria Math" w:cs="Cambria Math"/>
+        </w:rPr>
+        <w:t>‑</w:t>
+      </w:r>
+      <w:r>
+        <w:t>1 posts in `posts-weeks-1-4.md`. Tag @parkatlas.io reshares.</w:t>
+      </w:r>
+    </w:p>
+    <w:p/>
+    <w:p>
+      <w:r>
+        <w:t>**Build 39 (2.1) backlog**</w:t>
+      </w:r>
+    </w:p>
+    <w:p>
+      <w:r>
+        <w:t>9. Soften share-card copy ("free", "of 63") to match the site's outdoors-first voice.</w:t>
+      </w:r>
+    </w:p>
+    <w:p>
+      <w:r>
+        <w:t>10. Google Sign-In: create iOS + web client IDs in Google Cloud, set `EXPO_PUBLIC_GOOGLE_IOS_CLIENT_ID` in EAS, re-add the plugin.</w:t>
+      </w:r>
+    </w:p>
+    <w:p>
+      <w:r>
+        <w:t>11. RevenueCat Pro paywall; two-column iPad layout.</w:t>
+      </w:r>
+    </w:p>
+    <w:p/>
+    <w:p>
+      <w:r>
+        <w:t>## Affiliates and advertising on parkatlas.io</w:t>
+      </w:r>
+    </w:p>
+    <w:p/>
+    <w:p>
+      <w:r>
+        <w:t>Two different things — approach both, but affiliates first because they need no permission.</w:t>
+      </w:r>
+    </w:p>
+    <w:p/>
+    <w:p>
+      <w:r>
+        <w:t>**A. Affiliate programs (apply; no outreach needed).** Best fits for park pages:</w:t>
+      </w:r>
+    </w:p>
+    <w:p>
+      <w:r>
+        <w:t>- **</w:t>
+      </w:r>
+      <w:bookmarkStart w:id="3" w:name="OLE_LINK4"/>
+      <w:r>
+        <w:t>Amazon Associates</w:t>
+      </w:r>
+      <w:bookmarkEnd w:id="3"/>
+      <w:r>
+        <w:t xml:space="preserve">** — gear, guidebooks, the America the Beautiful pass. Easiest </w:t>
+      </w:r>
+      <w:r>
+        <w:t>approval; note you need qualifying sales within the first 180 days or the account closes.</w:t>
+      </w:r>
+    </w:p>
+    <w:p>
+      <w:r>
+        <w:t>--</w:t>
+      </w:r>
+      <w:r>
+        <w:t xml:space="preserve">created.  Now to get the links. </w:t>
+      </w:r>
+    </w:p>
+    <w:p/>
+    <w:p>
+      <w:r>
+        <w:t>- **REI, Backcountry, Moosejaw** — outdoor retailers typically run through networks like **AvantLink** or **Impact**; apply on the network, then to each brand.</w:t>
+      </w:r>
+    </w:p>
+    <w:p>
+      <w:r>
+        <w:t>- **Lodging/experiences** — **Booking.com**, **Expedia**, **Hipcamp**, **Viator/GetYourGuide** all have affiliate programs (direct or via Impact/CJ/Awin). Put "Where to stay near Zion" blocks on park pages.</w:t>
+      </w:r>
+    </w:p>
+    <w:p>
+      <w:r>
+        <w:t>- **AllTrails**, **Gaia GPS**, **onX** — check their sites for an affiliate/partner page; they come and go.</w:t>
+      </w:r>
+    </w:p>
+    <w:p/>
+    <w:p>
+      <w:r>
+        <w:t xml:space="preserve">What they look for when approving: a live site with real content (you have 63 pages), a privacy policy (done), and an FTC disclosure line ("Some links are affiliate links; we may earn a </w:t>
+      </w:r>
+      <w:r>
+        <w:lastRenderedPageBreak/>
+        <w:t>commission at no cost to you") — add that to the park-page footer before applying. Application typically takes days to a couple of weeks; several reject sites under ~1k monthly visits, so Search Console + Instagram traffic first helps.</w:t>
+      </w:r>
+    </w:p>
+    <w:p/>
+    <w:p>
+      <w:r>
+        <w:t>**B. Direct sponsors/advertisers (outreach).** Realistic targets at your stage are small outdoor brands, park-adjacent lodges/outfitters, and other indie apps — not REI's marketing team. Good angles: a "Presented by" slot on the checklist PDF, a sponsor card on the parks index, or a sponsored newsletter issue.</w:t>
+      </w:r>
+    </w:p>
+    <w:p/>
+    <w:p>
+      <w:r>
+        <w:t>Find contacts: brand site → "Partnerships"/"Press" page, or LinkedIn for "partnerships", "affiliate manager", "brand marketing". Instagram DM works for small brands.</w:t>
+      </w:r>
+    </w:p>
+    <w:p/>
+    <w:p>
+      <w:r>
+        <w:t>Template (short; one ask; numbers when you have them):</w:t>
+      </w:r>
+    </w:p>
+    <w:p/>
+    <w:p>
+      <w:r>
+        <w:t>&gt; Subject: ParkAtlas × [Brand] — reaching national park travelers</w:t>
+      </w:r>
+    </w:p>
+    <w:p>
+      <w:r>
+        <w:t>&gt;</w:t>
+      </w:r>
+    </w:p>
+    <w:p>
+      <w:r>
+        <w:t>&gt; Hi [Name] — I'm Karen, founder of ParkAtlas, an iOS app and site (parkatlas.io) for people who track and plan their national and state park trips. We publish guides for all 63 national parks and a free printable checklist that's downloaded [N] times a month; our audience is [N] monthly visitors / [N] Instagram followers who are actively planning trips.</w:t>
+      </w:r>
+    </w:p>
+    <w:p>
+      <w:r>
+        <w:t>&gt;</w:t>
+      </w:r>
+    </w:p>
+    <w:p>
+      <w:r>
+        <w:t>&gt; I'd love to feature [Brand] as the sponsor of our [Zion/Utah parks] pages and the September checklist mailing. Packages start at $[X] for a month, or I'm glad to work on an affiliate/rev-share basis if you prefer.</w:t>
+      </w:r>
+    </w:p>
+    <w:p>
+      <w:r>
+        <w:t>&gt;</w:t>
+      </w:r>
+    </w:p>
+    <w:p>
+      <w:r>
+        <w:t>&gt; Would a 15-minute call next week work? Happy to send a media kit.</w:t>
+      </w:r>
+    </w:p>
+    <w:p/>
+    <w:p>
+      <w:r>
+        <w:t>Build a one-page media kit (audience, screenshots, page list, pricing) before sending — I can generate it from the site assets when you're ready. Rule of thumb for pricing early on: ~$10–20 CPM equivalent for display, or just start with affiliate/rev-share until you have traffic numbers to sell against.</w:t>
+      </w:r>
+    </w:p>
+    <w:p/>
+    <w:p>
+      <w:r>
+        <w:t>Want me to add the FTC disclosure line and an affiliate-ready "Plan your trip" block to the park-page template now, so the pages are approval-ready when you apply?</w:t>
+      </w:r>
+    </w:p>
+    <w:p/>
+    <w:p/>
+    <w:p>
+      <w:pPr>
+        <w:rPr>
+          <w:b/>
+          <w:bCs/>
+        </w:rPr>
+      </w:pPr>
+      <w:r>
+        <w:rPr>
+          <w:b/>
+          <w:bCs/>
+        </w:rPr>
+        <w:t>INSTAGRAM LAUNCH / POST 2.0</w:t>
+      </w:r>
+    </w:p>
+    <w:p>
+      <w:pPr>
+        <w:spacing w:before="100" w:beforeAutospacing="1" w:after="100" w:afterAutospacing="1"/>
+      </w:pPr>
+      <w:r>
+        <w:t xml:space="preserve">Yes — this is the right launch tactic for ParkAtlas. I’d target people whose audience already thinks in terms of </w:t>
+      </w:r>
+      <w:r>
+        <w:rPr>
+          <w:b/>
+          <w:bCs/>
+        </w:rPr>
+        <w:t>“parks visited / parks remaining / collecting experiences”</w:t>
+      </w:r>
+      <w:r>
+        <w:t>, rather than generic hiking influencers.</w:t>
+      </w:r>
+    </w:p>
+    <w:p>
+      <w:pPr>
+        <w:spacing w:before="100" w:beforeAutospacing="1" w:after="100" w:afterAutospacing="1"/>
+      </w:pPr>
+      <w:r>
+        <w:t>I dug for creators who look genuinely reachable and found a first batch I’d pursue:</w:t>
+      </w:r>
+    </w:p>
+    <w:tbl>
+      <w:tblPr>
+        <w:tblW w:w="0" w:type="auto"/>
+        <w:tblCellSpacing w:w="15" w:type="dxa"/>
+        <w:tblCellMar>
+          <w:top w:w="15" w:type="dxa"/>
+          <w:left w:w="15" w:type="dxa"/>
+          <w:bottom w:w="15" w:type="dxa"/>
+          <w:right w:w="15" w:type="dxa"/>
+        </w:tblCellMar>
+        <w:tblLook w:val="04A0" w:firstRow="1" w:lastRow="0" w:firstColumn="1" w:lastColumn="0" w:noHBand="0" w:noVBand="1"/>
+      </w:tblPr>
+      <w:tblGrid>
+        <w:gridCol w:w="888"/>
+        <w:gridCol w:w="2847"/>
+        <w:gridCol w:w="3360"/>
+        <w:gridCol w:w="2265"/>
+      </w:tblGrid>
+      <w:tr>
+        <w:trPr>
+          <w:tblHeader/>
+          <w:tblCellSpacing w:w="15" w:type="dxa"/>
+        </w:trPr>
+        <w:tc>
+          <w:tcPr>
+            <w:tcW w:w="0" w:type="auto"/>
+            <w:vAlign w:val="center"/>
+            <w:hideMark/>
+          </w:tcPr>
+          <w:p>
             <w:pPr>
+              <w:jc w:val="center"/>
               <w:rPr>
-                <w:rFonts w:ascii="Times New Roman" w:eastAsia="Times New Roman" w:hAnsi="Times New Roman" w:cs="Times New Roman"/>
-                <w:kern w:val="0"/>
-                <w:sz w:val="24"/>
-                <w14:ligatures w14:val="none"/>
+                <w:b/>
+                <w:bCs/>
               </w:rPr>
             </w:pPr>
             <w:r>
               <w:rPr>
-                <w:rFonts w:ascii="Times New Roman" w:eastAsia="Times New Roman" w:hAnsi="Times New Roman" w:cs="Times New Roman"/>
-                <w:kern w:val="0"/>
-                <w:sz w:val="24"/>
-                <w14:ligatures w14:val="none"/>
+                <w:b/>
+                <w:bCs/>
               </w:rPr>
-              <w:t>2 creator posts</w:t>
+              <w:lastRenderedPageBreak/>
+              <w:t>Priority</w:t>
             </w:r>
           </w:p>
         </w:tc>
@@ -2572,21 +1803,18 @@
           </w:tcPr>
           <w:p>
             <w:pPr>
+              <w:jc w:val="center"/>
               <w:rPr>
-                <w:rFonts w:ascii="Times New Roman" w:eastAsia="Times New Roman" w:hAnsi="Times New Roman" w:cs="Times New Roman"/>
-                <w:kern w:val="0"/>
-                <w:sz w:val="24"/>
-                <w14:ligatures w14:val="none"/>
+                <w:b/>
+                <w:bCs/>
               </w:rPr>
             </w:pPr>
             <w:r>
               <w:rPr>
-                <w:rFonts w:ascii="Times New Roman" w:eastAsia="Times New Roman" w:hAnsi="Times New Roman" w:cs="Times New Roman"/>
-                <w:kern w:val="0"/>
-                <w:sz w:val="24"/>
-                <w14:ligatures w14:val="none"/>
+                <w:b/>
+                <w:bCs/>
               </w:rPr>
-              <w:t>luck + DMs</w:t>
+              <w:t>Creator</w:t>
             </w:r>
           </w:p>
         </w:tc>
@@ -2598,21 +1826,806 @@
           </w:tcPr>
           <w:p>
             <w:pPr>
+              <w:jc w:val="center"/>
               <w:rPr>
-                <w:rFonts w:ascii="Times New Roman" w:eastAsia="Times New Roman" w:hAnsi="Times New Roman" w:cs="Times New Roman"/>
-                <w:kern w:val="0"/>
-                <w:sz w:val="24"/>
-                <w14:ligatures w14:val="none"/>
+                <w:b/>
+                <w:bCs/>
               </w:rPr>
             </w:pPr>
             <w:r>
               <w:rPr>
-                <w:rFonts w:ascii="Times New Roman" w:eastAsia="Times New Roman" w:hAnsi="Times New Roman" w:cs="Times New Roman"/>
-                <w:kern w:val="0"/>
-                <w:sz w:val="24"/>
-                <w14:ligatures w14:val="none"/>
+                <w:b/>
+                <w:bCs/>
               </w:rPr>
-              <w:t>200–1,000</w:t>
+              <w:t>Why they fit ParkAtlas</w:t>
+            </w:r>
+          </w:p>
+        </w:tc>
+        <w:tc>
+          <w:tcPr>
+            <w:tcW w:w="0" w:type="auto"/>
+            <w:vAlign w:val="center"/>
+            <w:hideMark/>
+          </w:tcPr>
+          <w:p>
+            <w:pPr>
+              <w:jc w:val="center"/>
+              <w:rPr>
+                <w:b/>
+                <w:bCs/>
+              </w:rPr>
+            </w:pPr>
+            <w:r>
+              <w:rPr>
+                <w:b/>
+                <w:bCs/>
+              </w:rPr>
+              <w:t>Approx. size / reach</w:t>
+            </w:r>
+          </w:p>
+        </w:tc>
+      </w:tr>
+      <w:tr>
+        <w:trPr>
+          <w:tblCellSpacing w:w="15" w:type="dxa"/>
+        </w:trPr>
+        <w:tc>
+          <w:tcPr>
+            <w:tcW w:w="0" w:type="auto"/>
+            <w:vAlign w:val="center"/>
+            <w:hideMark/>
+          </w:tcPr>
+          <w:p>
+            <w:r>
+              <w:rPr>
+                <w:b/>
+                <w:bCs/>
+              </w:rPr>
+              <w:t>1</w:t>
+            </w:r>
+          </w:p>
+        </w:tc>
+        <w:tc>
+          <w:tcPr>
+            <w:tcW w:w="0" w:type="auto"/>
+            <w:vAlign w:val="center"/>
+            <w:hideMark/>
+          </w:tcPr>
+          <w:p>
+            <w:r>
+              <w:rPr>
+                <w:b/>
+                <w:bCs/>
+              </w:rPr>
+              <w:t>@parttimeadventuring — Missy &amp; Shane</w:t>
+            </w:r>
+          </w:p>
+        </w:tc>
+        <w:tc>
+          <w:tcPr>
+            <w:tcW w:w="0" w:type="auto"/>
+            <w:vAlign w:val="center"/>
+            <w:hideMark/>
+          </w:tcPr>
+          <w:p>
+            <w:r>
+              <w:t xml:space="preserve">Almost tailor-made. Couple actively working toward all 63; currently </w:t>
+            </w:r>
+            <w:r>
+              <w:rPr>
+                <w:b/>
+                <w:bCs/>
+              </w:rPr>
+              <w:t>54/63</w:t>
+            </w:r>
+            <w:r>
+              <w:t>. Their content is practical park planning + documenting their progress. (</w:t>
+            </w:r>
+            <w:hyperlink r:id="rId5" w:tooltip="| Part-Time Adventuring" w:history="1">
+              <w:r>
+                <w:rPr>
+                  <w:color w:val="0000FF"/>
+                  <w:u w:val="single"/>
+                </w:rPr>
+                <w:t>P</w:t>
+              </w:r>
+              <w:r>
+                <w:rPr>
+                  <w:color w:val="0000FF"/>
+                  <w:u w:val="single"/>
+                </w:rPr>
+                <w:t>a</w:t>
+              </w:r>
+              <w:r>
+                <w:rPr>
+                  <w:color w:val="0000FF"/>
+                  <w:u w:val="single"/>
+                </w:rPr>
+                <w:t>rt-Time Adventuring</w:t>
+              </w:r>
+            </w:hyperlink>
+            <w:r>
+              <w:t>)</w:t>
+            </w:r>
+          </w:p>
+        </w:tc>
+        <w:tc>
+          <w:tcPr>
+            <w:tcW w:w="0" w:type="auto"/>
+            <w:vAlign w:val="center"/>
+            <w:hideMark/>
+          </w:tcPr>
+          <w:p>
+            <w:r>
+              <w:t>Mid-size ecosystem; 30K+ monthly Pinterest readers; IG size needs direct verification</w:t>
+            </w:r>
+          </w:p>
+        </w:tc>
+      </w:tr>
+      <w:tr>
+        <w:trPr>
+          <w:tblCellSpacing w:w="15" w:type="dxa"/>
+        </w:trPr>
+        <w:tc>
+          <w:tcPr>
+            <w:tcW w:w="0" w:type="auto"/>
+            <w:vAlign w:val="center"/>
+            <w:hideMark/>
+          </w:tcPr>
+          <w:p>
+            <w:r>
+              <w:rPr>
+                <w:b/>
+                <w:bCs/>
+              </w:rPr>
+              <w:t>2</w:t>
+            </w:r>
+          </w:p>
+        </w:tc>
+        <w:tc>
+          <w:tcPr>
+            <w:tcW w:w="0" w:type="auto"/>
+            <w:vAlign w:val="center"/>
+            <w:hideMark/>
+          </w:tcPr>
+          <w:p>
+            <w:r>
+              <w:rPr>
+                <w:b/>
+                <w:bCs/>
+              </w:rPr>
+              <w:t>@bigbravenomad — Tavia</w:t>
+            </w:r>
+          </w:p>
+        </w:tc>
+        <w:tc>
+          <w:tcPr>
+            <w:tcW w:w="0" w:type="auto"/>
+            <w:vAlign w:val="center"/>
+            <w:hideMark/>
+          </w:tcPr>
+          <w:p>
+            <w:r>
+              <w:rPr>
+                <w:b/>
+                <w:bCs/>
+              </w:rPr>
+              <w:t>51/63 parks</w:t>
+            </w:r>
+            <w:r>
+              <w:t xml:space="preserve">, family travel, detailed park guides, very active creator. Most importantly, she’s still </w:t>
+            </w:r>
+            <w:r>
+              <w:rPr>
+                <w:i/>
+                <w:iCs/>
+              </w:rPr>
+              <w:t>in the process</w:t>
+            </w:r>
+            <w:r>
+              <w:t>, which makes ParkAtlas useful rather than retrospective. (</w:t>
+            </w:r>
+            <w:hyperlink r:id="rId6" w:tooltip="Instagram — Big Brave Nomad" w:history="1">
+              <w:r>
+                <w:rPr>
+                  <w:color w:val="0000FF"/>
+                  <w:u w:val="single"/>
+                </w:rPr>
+                <w:t>Big Br</w:t>
+              </w:r>
+              <w:r>
+                <w:rPr>
+                  <w:color w:val="0000FF"/>
+                  <w:u w:val="single"/>
+                </w:rPr>
+                <w:t>a</w:t>
+              </w:r>
+              <w:r>
+                <w:rPr>
+                  <w:color w:val="0000FF"/>
+                  <w:u w:val="single"/>
+                </w:rPr>
+                <w:t>ve Nomad</w:t>
+              </w:r>
+            </w:hyperlink>
+            <w:r>
+              <w:t>)</w:t>
+            </w:r>
+          </w:p>
+        </w:tc>
+        <w:tc>
+          <w:tcPr>
+            <w:tcW w:w="0" w:type="auto"/>
+            <w:vAlign w:val="center"/>
+            <w:hideMark/>
+          </w:tcPr>
+          <w:p>
+            <w:r>
+              <w:t>~</w:t>
+            </w:r>
+            <w:r>
+              <w:rPr>
+                <w:b/>
+                <w:bCs/>
+              </w:rPr>
+              <w:t>16–21K IG</w:t>
+            </w:r>
+            <w:r>
+              <w:t xml:space="preserve"> depending on source/date. (</w:t>
+            </w:r>
+            <w:hyperlink r:id="rId7" w:tooltip="150 TOP TRAVEL INFLUENCERS LIVING THE INTERNET’S MOST ENVIED LIFESTYLES IN 2026" w:history="1">
+              <w:r>
+                <w:rPr>
+                  <w:color w:val="0000FF"/>
+                  <w:u w:val="single"/>
+                </w:rPr>
+                <w:t>Amra and Elma LLC</w:t>
+              </w:r>
+            </w:hyperlink>
+            <w:r>
+              <w:t>)</w:t>
+            </w:r>
+          </w:p>
+        </w:tc>
+      </w:tr>
+      <w:tr>
+        <w:trPr>
+          <w:tblCellSpacing w:w="15" w:type="dxa"/>
+        </w:trPr>
+        <w:tc>
+          <w:tcPr>
+            <w:tcW w:w="0" w:type="auto"/>
+            <w:vAlign w:val="center"/>
+            <w:hideMark/>
+          </w:tcPr>
+          <w:p>
+            <w:r>
+              <w:rPr>
+                <w:b/>
+                <w:bCs/>
+              </w:rPr>
+              <w:t>3</w:t>
+            </w:r>
+          </w:p>
+        </w:tc>
+        <w:tc>
+          <w:tcPr>
+            <w:tcW w:w="0" w:type="auto"/>
+            <w:vAlign w:val="center"/>
+            <w:hideMark/>
+          </w:tcPr>
+          <w:p>
+            <w:r>
+              <w:rPr>
+                <w:b/>
+                <w:bCs/>
+              </w:rPr>
+              <w:t>@partnersexploringparks — Amy &amp; Nelson</w:t>
+            </w:r>
+          </w:p>
+        </w:tc>
+        <w:tc>
+          <w:tcPr>
+            <w:tcW w:w="0" w:type="auto"/>
+            <w:vAlign w:val="center"/>
+            <w:hideMark/>
+          </w:tcPr>
+          <w:p>
+            <w:r>
+              <w:t xml:space="preserve">Couple with regular jobs whose explicit mission includes </w:t>
+            </w:r>
+            <w:r>
+              <w:rPr>
+                <w:b/>
+                <w:bCs/>
+              </w:rPr>
+              <w:t>all 63 National Parks AND 280+ California State Parks</w:t>
+            </w:r>
+            <w:r>
+              <w:t>. That state-park angle is especially good because ParkAtlas goes beyond the standard 63 checklist. (</w:t>
+            </w:r>
+            <w:hyperlink r:id="rId8" w:tooltip="About — adventures of the semi-adventurous" w:history="1">
+              <w:r>
+                <w:rPr>
+                  <w:color w:val="0000FF"/>
+                  <w:u w:val="single"/>
+                </w:rPr>
+                <w:t>adventu</w:t>
+              </w:r>
+              <w:r>
+                <w:rPr>
+                  <w:color w:val="0000FF"/>
+                  <w:u w:val="single"/>
+                </w:rPr>
+                <w:t>r</w:t>
+              </w:r>
+              <w:r>
+                <w:rPr>
+                  <w:color w:val="0000FF"/>
+                  <w:u w:val="single"/>
+                </w:rPr>
+                <w:t>e</w:t>
+              </w:r>
+              <w:r>
+                <w:rPr>
+                  <w:color w:val="0000FF"/>
+                  <w:u w:val="single"/>
+                </w:rPr>
+                <w:t>s of the semi-adventurous</w:t>
+              </w:r>
+            </w:hyperlink>
+            <w:r>
+              <w:t>)</w:t>
+            </w:r>
+          </w:p>
+        </w:tc>
+        <w:tc>
+          <w:tcPr>
+            <w:tcW w:w="0" w:type="auto"/>
+            <w:vAlign w:val="center"/>
+            <w:hideMark/>
+          </w:tcPr>
+          <w:p>
+            <w:r>
+              <w:t>Looks smaller/reachable; follower count needs verification</w:t>
+            </w:r>
+          </w:p>
+        </w:tc>
+      </w:tr>
+      <w:tr>
+        <w:trPr>
+          <w:tblCellSpacing w:w="15" w:type="dxa"/>
+        </w:trPr>
+        <w:tc>
+          <w:tcPr>
+            <w:tcW w:w="0" w:type="auto"/>
+            <w:vAlign w:val="center"/>
+            <w:hideMark/>
+          </w:tcPr>
+          <w:p>
+            <w:r>
+              <w:rPr>
+                <w:b/>
+                <w:bCs/>
+              </w:rPr>
+              <w:t>4</w:t>
+            </w:r>
+          </w:p>
+        </w:tc>
+        <w:tc>
+          <w:tcPr>
+            <w:tcW w:w="0" w:type="auto"/>
+            <w:vAlign w:val="center"/>
+            <w:hideMark/>
+          </w:tcPr>
+          <w:p>
+            <w:r>
+              <w:rPr>
+                <w:b/>
+                <w:bCs/>
+              </w:rPr>
+              <w:t>@thecolorfulkayak — Kayla Allen Yakub</w:t>
+            </w:r>
+          </w:p>
+        </w:tc>
+        <w:tc>
+          <w:tcPr>
+            <w:tcW w:w="0" w:type="auto"/>
+            <w:vAlign w:val="center"/>
+            <w:hideMark/>
+          </w:tcPr>
+          <w:p>
+            <w:r>
+              <w:t xml:space="preserve">Very distinctive use case: she is literally tracking a mission to </w:t>
+            </w:r>
+            <w:r>
+              <w:rPr>
+                <w:b/>
+                <w:bCs/>
+              </w:rPr>
+              <w:t>paint all 63 parks on-site</w:t>
+            </w:r>
+            <w:r>
+              <w:t xml:space="preserve"> and is currently at </w:t>
+            </w:r>
+            <w:r>
+              <w:rPr>
+                <w:b/>
+                <w:bCs/>
+              </w:rPr>
+              <w:t>39/63</w:t>
+            </w:r>
+            <w:r>
+              <w:t>. Great candidate for progress tracking, notes, photos and collections. (</w:t>
+            </w:r>
+            <w:hyperlink r:id="rId9" w:tooltip="The Colorful Kayak | National Park Paintings" w:history="1">
+              <w:r>
+                <w:rPr>
+                  <w:color w:val="0000FF"/>
+                  <w:u w:val="single"/>
+                </w:rPr>
+                <w:t>The Co</w:t>
+              </w:r>
+              <w:r>
+                <w:rPr>
+                  <w:color w:val="0000FF"/>
+                  <w:u w:val="single"/>
+                </w:rPr>
+                <w:t>l</w:t>
+              </w:r>
+              <w:r>
+                <w:rPr>
+                  <w:color w:val="0000FF"/>
+                  <w:u w:val="single"/>
+                </w:rPr>
+                <w:t>orful Kayak</w:t>
+              </w:r>
+            </w:hyperlink>
+            <w:r>
+              <w:t>)</w:t>
+            </w:r>
+          </w:p>
+        </w:tc>
+        <w:tc>
+          <w:tcPr>
+            <w:tcW w:w="0" w:type="auto"/>
+            <w:vAlign w:val="center"/>
+            <w:hideMark/>
+          </w:tcPr>
+          <w:p>
+            <w:r>
+              <w:t>Likely micro-to-mid creator; needs current IG count</w:t>
+            </w:r>
+          </w:p>
+        </w:tc>
+      </w:tr>
+      <w:tr>
+        <w:trPr>
+          <w:tblCellSpacing w:w="15" w:type="dxa"/>
+        </w:trPr>
+        <w:tc>
+          <w:tcPr>
+            <w:tcW w:w="0" w:type="auto"/>
+            <w:vAlign w:val="center"/>
+            <w:hideMark/>
+          </w:tcPr>
+          <w:p>
+            <w:r>
+              <w:rPr>
+                <w:b/>
+                <w:bCs/>
+              </w:rPr>
+              <w:t>5</w:t>
+            </w:r>
+          </w:p>
+        </w:tc>
+        <w:tc>
+          <w:tcPr>
+            <w:tcW w:w="0" w:type="auto"/>
+            <w:vAlign w:val="center"/>
+            <w:hideMark/>
+          </w:tcPr>
+          <w:p>
+            <w:r>
+              <w:rPr>
+                <w:b/>
+                <w:bCs/>
+              </w:rPr>
+              <w:t>@parkchasers — Greg &amp; Amy</w:t>
+            </w:r>
+          </w:p>
+        </w:tc>
+        <w:tc>
+          <w:tcPr>
+            <w:tcW w:w="0" w:type="auto"/>
+            <w:vAlign w:val="center"/>
+            <w:hideMark/>
+          </w:tcPr>
+          <w:p>
+            <w:r>
+              <w:t xml:space="preserve">These two are deeper park nerds than typical travel influencers: they’re working through </w:t>
+            </w:r>
+            <w:r>
+              <w:rPr>
+                <w:b/>
+                <w:bCs/>
+              </w:rPr>
+              <w:t>400+ NPS units</w:t>
+            </w:r>
+            <w:r>
+              <w:t>, not just the 63 parks, and have visited 140+ units. That makes them potentially excellent product-feedback people. (</w:t>
+            </w:r>
+            <w:hyperlink r:id="rId10" w:tooltip="Meet the Park Chasers - Park Chasers" w:history="1">
+              <w:r>
+                <w:rPr>
+                  <w:color w:val="0000FF"/>
+                  <w:u w:val="single"/>
+                </w:rPr>
+                <w:t>P</w:t>
+              </w:r>
+              <w:r>
+                <w:rPr>
+                  <w:color w:val="0000FF"/>
+                  <w:u w:val="single"/>
+                </w:rPr>
+                <w:t>a</w:t>
+              </w:r>
+              <w:r>
+                <w:rPr>
+                  <w:color w:val="0000FF"/>
+                  <w:u w:val="single"/>
+                </w:rPr>
+                <w:t>rk Chasers</w:t>
+              </w:r>
+            </w:hyperlink>
+            <w:r>
+              <w:t>)</w:t>
+            </w:r>
+          </w:p>
+        </w:tc>
+        <w:tc>
+          <w:tcPr>
+            <w:tcW w:w="0" w:type="auto"/>
+            <w:vAlign w:val="center"/>
+            <w:hideMark/>
+          </w:tcPr>
+          <w:p>
+            <w:r>
+              <w:t>Likely reachable niche creator</w:t>
+            </w:r>
+          </w:p>
+        </w:tc>
+      </w:tr>
+      <w:tr>
+        <w:trPr>
+          <w:tblCellSpacing w:w="15" w:type="dxa"/>
+        </w:trPr>
+        <w:tc>
+          <w:tcPr>
+            <w:tcW w:w="0" w:type="auto"/>
+            <w:vAlign w:val="center"/>
+            <w:hideMark/>
+          </w:tcPr>
+          <w:p>
+            <w:r>
+              <w:rPr>
+                <w:b/>
+                <w:bCs/>
+              </w:rPr>
+              <w:t>6</w:t>
+            </w:r>
+          </w:p>
+        </w:tc>
+        <w:tc>
+          <w:tcPr>
+            <w:tcW w:w="0" w:type="auto"/>
+            <w:vAlign w:val="center"/>
+            <w:hideMark/>
+          </w:tcPr>
+          <w:p>
+            <w:r>
+              <w:rPr>
+                <w:b/>
+                <w:bCs/>
+              </w:rPr>
+              <w:t>@gazeatthenationalparks — Dustin &amp; Mike</w:t>
+            </w:r>
+          </w:p>
+        </w:tc>
+        <w:tc>
+          <w:tcPr>
+            <w:tcW w:w="0" w:type="auto"/>
+            <w:vAlign w:val="center"/>
+            <w:hideMark/>
+          </w:tcPr>
+          <w:p>
+            <w:r>
+              <w:t>Couple + National Parks podcast + explicit park-by-park journey. Good candidate for someone who might actually discuss a useful parks product rather than simply post a pretty Reel. (</w:t>
+            </w:r>
+            <w:hyperlink r:id="rId11" w:tooltip="Park Chaser Profile: Gaze at the National Parks - Park Chasers" w:history="1">
+              <w:r>
+                <w:rPr>
+                  <w:color w:val="0000FF"/>
+                  <w:u w:val="single"/>
+                </w:rPr>
+                <w:t>Park Chasers</w:t>
+              </w:r>
+            </w:hyperlink>
+            <w:r>
+              <w:t>)</w:t>
+            </w:r>
+          </w:p>
+        </w:tc>
+        <w:tc>
+          <w:tcPr>
+            <w:tcW w:w="0" w:type="auto"/>
+            <w:vAlign w:val="center"/>
+            <w:hideMark/>
+          </w:tcPr>
+          <w:p>
+            <w:r>
+              <w:t>Needs current IG count</w:t>
+            </w:r>
+          </w:p>
+        </w:tc>
+      </w:tr>
+      <w:tr>
+        <w:trPr>
+          <w:tblCellSpacing w:w="15" w:type="dxa"/>
+        </w:trPr>
+        <w:tc>
+          <w:tcPr>
+            <w:tcW w:w="0" w:type="auto"/>
+            <w:vAlign w:val="center"/>
+            <w:hideMark/>
+          </w:tcPr>
+          <w:p>
+            <w:r>
+              <w:rPr>
+                <w:b/>
+                <w:bCs/>
+              </w:rPr>
+              <w:t>7</w:t>
+            </w:r>
+          </w:p>
+        </w:tc>
+        <w:tc>
+          <w:tcPr>
+            <w:tcW w:w="0" w:type="auto"/>
+            <w:vAlign w:val="center"/>
+            <w:hideMark/>
+          </w:tcPr>
+          <w:p>
+            <w:r>
+              <w:rPr>
+                <w:b/>
+                <w:bCs/>
+              </w:rPr>
+              <w:t>@wanderfulwives — Sam &amp; Justine</w:t>
+            </w:r>
+          </w:p>
+        </w:tc>
+        <w:tc>
+          <w:tcPr>
+            <w:tcW w:w="0" w:type="auto"/>
+            <w:vAlign w:val="center"/>
+            <w:hideMark/>
+          </w:tcPr>
+          <w:p>
+            <w:r>
+              <w:t xml:space="preserve">Outdoor/adventure couple with a strong national-parks connection </w:t>
+            </w:r>
+            <w:r>
+              <w:lastRenderedPageBreak/>
+              <w:t>and established storytelling audience. Parks Project has featured them specifically around their relationship with national parks. (</w:t>
+            </w:r>
+            <w:hyperlink r:id="rId12" w:tooltip="People in the Parks: Sam &amp; Justine – Parks Project" w:history="1">
+              <w:r>
+                <w:rPr>
+                  <w:color w:val="0000FF"/>
+                  <w:u w:val="single"/>
+                </w:rPr>
+                <w:t>Parks Project</w:t>
+              </w:r>
+            </w:hyperlink>
+            <w:r>
+              <w:t>)</w:t>
+            </w:r>
+          </w:p>
+        </w:tc>
+        <w:tc>
+          <w:tcPr>
+            <w:tcW w:w="0" w:type="auto"/>
+            <w:vAlign w:val="center"/>
+            <w:hideMark/>
+          </w:tcPr>
+          <w:p>
+            <w:r>
+              <w:lastRenderedPageBreak/>
+              <w:t>Need to verify current follower count</w:t>
+            </w:r>
+          </w:p>
+        </w:tc>
+      </w:tr>
+      <w:tr>
+        <w:trPr>
+          <w:tblCellSpacing w:w="15" w:type="dxa"/>
+        </w:trPr>
+        <w:tc>
+          <w:tcPr>
+            <w:tcW w:w="0" w:type="auto"/>
+            <w:vAlign w:val="center"/>
+            <w:hideMark/>
+          </w:tcPr>
+          <w:p>
+            <w:r>
+              <w:rPr>
+                <w:b/>
+                <w:bCs/>
+              </w:rPr>
+              <w:t>8</w:t>
+            </w:r>
+          </w:p>
+        </w:tc>
+        <w:tc>
+          <w:tcPr>
+            <w:tcW w:w="0" w:type="auto"/>
+            <w:vAlign w:val="center"/>
+            <w:hideMark/>
+          </w:tcPr>
+          <w:p>
+            <w:r>
+              <w:rPr>
+                <w:b/>
+                <w:bCs/>
+              </w:rPr>
+              <w:t>@parkstampfever</w:t>
+            </w:r>
+          </w:p>
+        </w:tc>
+        <w:tc>
+          <w:tcPr>
+            <w:tcW w:w="0" w:type="auto"/>
+            <w:vAlign w:val="center"/>
+            <w:hideMark/>
+          </w:tcPr>
+          <w:p>
+            <w:r>
+              <w:t xml:space="preserve">This is the </w:t>
+            </w:r>
+            <w:r>
+              <w:rPr>
+                <w:b/>
+                <w:bCs/>
+              </w:rPr>
+              <w:t>passport-stamp collector niche</w:t>
+            </w:r>
+            <w:r>
+              <w:t xml:space="preserve"> you specifically mentioned. Park Chasers called it one of the few accounts devoted specifically to the Passport to Your National Parks stamp program. (</w:t>
+            </w:r>
+            <w:hyperlink r:id="rId13" w:tooltip="19 National Park Instagram Accounts to Follow in 2019 - Park Chasers" w:history="1">
+              <w:r>
+                <w:rPr>
+                  <w:color w:val="0000FF"/>
+                  <w:u w:val="single"/>
+                </w:rPr>
+                <w:t>Park Chasers</w:t>
+              </w:r>
+            </w:hyperlink>
+            <w:r>
+              <w:t>)</w:t>
+            </w:r>
+          </w:p>
+        </w:tc>
+        <w:tc>
+          <w:tcPr>
+            <w:tcW w:w="0" w:type="auto"/>
+            <w:vAlign w:val="center"/>
+            <w:hideMark/>
+          </w:tcPr>
+          <w:p>
+            <w:r>
+              <w:t>Unknown current count, but extremely high audience fit</w:t>
             </w:r>
           </w:p>
         </w:tc>
@@ -2621,259 +2634,383 @@
     <w:p>
       <w:pPr>
         <w:spacing w:before="100" w:beforeAutospacing="1" w:after="100" w:afterAutospacing="1"/>
-        <w:rPr>
-          <w:rFonts w:ascii="Times New Roman" w:eastAsia="Times New Roman" w:hAnsi="Times New Roman" w:cs="Times New Roman"/>
-          <w:kern w:val="0"/>
-          <w:sz w:val="24"/>
-          <w14:ligatures w14:val="none"/>
-        </w:rPr>
-      </w:pPr>
-      <w:r>
-        <w:rPr>
-          <w:rFonts w:ascii="Times New Roman" w:eastAsia="Times New Roman" w:hAnsi="Times New Roman" w:cs="Times New Roman"/>
-          <w:kern w:val="0"/>
-          <w:sz w:val="24"/>
-          <w14:ligatures w14:val="none"/>
-        </w:rPr>
-        <w:t>You cross 1,000 on Reddit + Facebook alone if two posts land. Video is what gets you to 10k.</w:t>
-      </w:r>
-    </w:p>
-    <w:p>
-      <w:pPr>
-        <w:spacing w:before="100" w:beforeAutospacing="1" w:after="100" w:afterAutospacing="1"/>
-        <w:rPr>
-          <w:rFonts w:ascii="Times New Roman" w:eastAsia="Times New Roman" w:hAnsi="Times New Roman" w:cs="Times New Roman"/>
-          <w:kern w:val="0"/>
-          <w:sz w:val="24"/>
-          <w14:ligatures w14:val="none"/>
-        </w:rPr>
-      </w:pPr>
-      <w:r>
-        <w:rPr>
-          <w:rFonts w:ascii="Times New Roman" w:eastAsia="Times New Roman" w:hAnsi="Times New Roman" w:cs="Times New Roman"/>
-          <w:b/>
-          <w:bCs/>
-          <w:kern w:val="0"/>
-          <w:sz w:val="24"/>
-          <w14:ligatures w14:val="none"/>
-        </w:rPr>
-        <w:t>Followers</w:t>
-      </w:r>
-      <w:r>
-        <w:rPr>
-          <w:rFonts w:ascii="Times New Roman" w:eastAsia="Times New Roman" w:hAnsi="Times New Roman" w:cs="Times New Roman"/>
-          <w:kern w:val="0"/>
-          <w:sz w:val="24"/>
-          <w14:ligatures w14:val="none"/>
-        </w:rPr>
-        <w:t xml:space="preserve"> follow downloads, not the other way around — don't optimize for them. 1k installs at a 5% follow rate is 50 followers; that's normal. The TikTok series is what builds the follower base, and it only matters as a distribution channel for Pro later.</w:t>
+        <w:outlineLvl w:val="2"/>
+        <w:rPr>
+          <w:b/>
+          <w:bCs/>
+          <w:sz w:val="27"/>
+          <w:szCs w:val="27"/>
+        </w:rPr>
+      </w:pPr>
+      <w:r>
+        <w:rPr>
+          <w:b/>
+          <w:bCs/>
+          <w:sz w:val="27"/>
+          <w:szCs w:val="27"/>
+        </w:rPr>
+        <w:t>The first three I would contact</w:t>
+      </w:r>
+    </w:p>
+    <w:p>
+      <w:pPr>
+        <w:spacing w:before="100" w:beforeAutospacing="1" w:after="100" w:afterAutospacing="1"/>
+      </w:pPr>
+      <w:r>
+        <w:rPr>
+          <w:b/>
+          <w:bCs/>
+        </w:rPr>
+        <w:t>@parttimeadventuring is my #1.</w:t>
+      </w:r>
+      <w:r>
+        <w:t xml:space="preserve"> Their identity is basically the ParkAtlas user persona: a couple with normal lives trying to complete all 63 and documenting their progress. They haven't finished yet, either. That gives you a very natural opening:</w:t>
+      </w:r>
+    </w:p>
+    <w:p>
+      <w:pPr>
+        <w:spacing w:before="100" w:beforeAutospacing="1" w:after="100" w:afterAutospacing="1"/>
+      </w:pPr>
+      <w:r>
+        <w:t>“You’re at 54/63, which is basically exactly who I built this for.”</w:t>
+      </w:r>
+    </w:p>
+    <w:p>
+      <w:pPr>
+        <w:spacing w:before="100" w:beforeAutospacing="1" w:after="100" w:afterAutospacing="1"/>
+      </w:pPr>
+      <w:r>
+        <w:t>That's vastly better than a generic influencer pitch.</w:t>
+      </w:r>
+    </w:p>
+    <w:p>
+      <w:pPr>
+        <w:spacing w:before="100" w:beforeAutospacing="1" w:after="100" w:afterAutospacing="1"/>
+      </w:pPr>
+      <w:r>
+        <w:rPr>
+          <w:b/>
+          <w:bCs/>
+        </w:rPr>
+        <w:t>@bigbravenomad is #2.</w:t>
+      </w:r>
+      <w:r>
+        <w:t xml:space="preserve"> She's already around the sweet spot of ~20K followers, has 51 parks completed, produces useful rather than purely aspirational content, and even explicitly invites collaborations. (</w:t>
+      </w:r>
+      <w:hyperlink r:id="rId14" w:tooltip="Contact Us — Big Brave Nomad" w:history="1">
+        <w:r>
+          <w:rPr>
+            <w:color w:val="0000FF"/>
+            <w:u w:val="single"/>
+          </w:rPr>
+          <w:t xml:space="preserve">Big </w:t>
+        </w:r>
+        <w:r>
+          <w:rPr>
+            <w:color w:val="0000FF"/>
+            <w:u w:val="single"/>
+          </w:rPr>
+          <w:t>B</w:t>
+        </w:r>
+        <w:r>
+          <w:rPr>
+            <w:color w:val="0000FF"/>
+            <w:u w:val="single"/>
+          </w:rPr>
+          <w:t>rave Nomad</w:t>
+        </w:r>
+      </w:hyperlink>
+      <w:r>
+        <w:t>)</w:t>
+      </w:r>
+    </w:p>
+    <w:p>
+      <w:pPr>
+        <w:spacing w:before="100" w:beforeAutospacing="1" w:after="100" w:afterAutospacing="1"/>
+      </w:pPr>
+      <w:r>
+        <w:rPr>
+          <w:b/>
+          <w:bCs/>
+        </w:rPr>
+        <w:t>@partnersexploringparks is #3</w:t>
+      </w:r>
+      <w:r>
+        <w:t xml:space="preserve">, even if their follower count turns out to be below 10K. I actually wouldn't let your 10K floor eliminate them. Their desire to visit </w:t>
+      </w:r>
+      <w:r>
+        <w:rPr>
+          <w:b/>
+          <w:bCs/>
+        </w:rPr>
+        <w:t>280+ California state parks plus the 63 national parks</w:t>
+      </w:r>
+      <w:r>
+        <w:t xml:space="preserve"> is unusually aligned with what differentiates ParkAtlas from one of the many “check off the 63” apps. (</w:t>
+      </w:r>
+      <w:hyperlink r:id="rId15" w:tooltip="About — adventures of the semi-adventurous" w:history="1">
+        <w:r>
+          <w:rPr>
+            <w:color w:val="0000FF"/>
+            <w:u w:val="single"/>
+          </w:rPr>
+          <w:t>adventures of the semi-adventurous</w:t>
+        </w:r>
+      </w:hyperlink>
+      <w:r>
+        <w:t>)</w:t>
+      </w:r>
+    </w:p>
+    <w:p>
+      <w:pPr>
+        <w:spacing w:before="100" w:beforeAutospacing="1" w:after="100" w:afterAutospacing="1"/>
+      </w:pPr>
+      <w:r>
+        <w:t xml:space="preserve">And that's important because I found something else while researching this: </w:t>
+      </w:r>
+      <w:r>
+        <w:rPr>
+          <w:b/>
+          <w:bCs/>
+        </w:rPr>
+        <w:t>you already have direct competitors positioning themselves as digital National Park passports.</w:t>
+      </w:r>
+      <w:r>
+        <w:t xml:space="preserve"> For example, Park'd markets itself as an iOS digital passport for the national parks with visit tracking, stamps, photos and notes. (</w:t>
+      </w:r>
+      <w:hyperlink r:id="rId16" w:tooltip="Park'd — National park passport · Stuck at Home LLC" w:history="1">
+        <w:r>
+          <w:rPr>
+            <w:color w:val="0000FF"/>
+            <w:u w:val="single"/>
+          </w:rPr>
+          <w:t>Stuck at Home LLC</w:t>
+        </w:r>
+      </w:hyperlink>
+      <w:r>
+        <w:t>) Another product, National Park Passport, offers a 0/63 tracker, map, photo journal, notes and ratings. (</w:t>
+      </w:r>
+      <w:hyperlink r:id="rId17" w:tooltip="Your National Park passport and travel journal · National Park Passport" w:history="1">
+        <w:r>
+          <w:rPr>
+            <w:color w:val="0000FF"/>
+            <w:u w:val="single"/>
+          </w:rPr>
+          <w:t>National Park Passport</w:t>
+        </w:r>
+      </w:hyperlink>
+      <w:r>
+        <w:t>)</w:t>
+      </w:r>
+    </w:p>
+    <w:p>
+      <w:pPr>
+        <w:spacing w:before="100" w:beforeAutospacing="1" w:after="100" w:afterAutospacing="1"/>
+      </w:pPr>
+      <w:r>
+        <w:t xml:space="preserve">That makes the </w:t>
+      </w:r>
+      <w:r>
+        <w:rPr>
+          <w:b/>
+          <w:bCs/>
+        </w:rPr>
+        <w:t>state parks + friends/social + adventure history + broader ParkAtlas concept</w:t>
+      </w:r>
+      <w:r>
+        <w:t xml:space="preserve"> much more important than simply “I made an app to track the 63 parks.”</w:t>
+      </w:r>
+    </w:p>
+    <w:p>
+      <w:pPr>
+        <w:spacing w:before="100" w:beforeAutospacing="1" w:after="100" w:afterAutospacing="1"/>
+        <w:outlineLvl w:val="2"/>
+        <w:rPr>
+          <w:b/>
+          <w:bCs/>
+          <w:sz w:val="27"/>
+          <w:szCs w:val="27"/>
+        </w:rPr>
+      </w:pPr>
+      <w:r>
+        <w:rPr>
+          <w:b/>
+          <w:bCs/>
+          <w:sz w:val="27"/>
+          <w:szCs w:val="27"/>
+        </w:rPr>
+        <w:t>I would change the outreach strategy slightly</w:t>
+      </w:r>
+    </w:p>
+    <w:p>
+      <w:pPr>
+        <w:spacing w:before="100" w:beforeAutospacing="1" w:after="100" w:afterAutospacing="1"/>
+      </w:pPr>
+      <w:r>
+        <w:t>Don't ask any of these people to post.</w:t>
+      </w:r>
+    </w:p>
+    <w:p>
+      <w:pPr>
+        <w:spacing w:before="100" w:beforeAutospacing="1" w:after="100" w:afterAutospacing="1"/>
+      </w:pPr>
+      <w:r>
+        <w:lastRenderedPageBreak/>
+        <w:t xml:space="preserve">Give them </w:t>
+      </w:r>
+      <w:r>
+        <w:rPr>
+          <w:b/>
+          <w:bCs/>
+        </w:rPr>
+        <w:t>founder early access</w:t>
+      </w:r>
+      <w:r>
+        <w:t xml:space="preserve"> and ask them to tear the product apart.</w:t>
+      </w:r>
+    </w:p>
+    <w:p>
+      <w:pPr>
+        <w:spacing w:before="100" w:beforeAutospacing="1" w:after="100" w:afterAutospacing="1"/>
+      </w:pPr>
+      <w:r>
+        <w:t>Something like:</w:t>
+      </w:r>
+    </w:p>
+    <w:p>
+      <w:pPr>
+        <w:spacing w:before="100" w:beforeAutospacing="1" w:after="100" w:afterAutospacing="1"/>
+      </w:pPr>
+      <w:bookmarkStart w:id="4" w:name="OLE_LINK5"/>
+      <w:r>
+        <w:t xml:space="preserve">Hey Missy &amp; Shane — </w:t>
+      </w:r>
+      <w:bookmarkStart w:id="5" w:name="OLE_LINK7"/>
+      <w:r>
+        <w:t>I've been following your 63-parks mission and saw you're at 54/63. I built something that I think you're almost the exact user for.</w:t>
+      </w:r>
+    </w:p>
+    <w:p>
+      <w:pPr>
+        <w:spacing w:before="100" w:beforeAutospacing="1" w:after="100" w:afterAutospacing="1"/>
+      </w:pPr>
+      <w:r>
+        <w:t>It's called ParkAtlas. I'm building it as a way to keep your national + state park history in one place — parks visited, trips, photos, hikes, favorites, what's next, and eventually sharing that with the people you adventure with.</w:t>
+      </w:r>
+    </w:p>
+    <w:p>
+      <w:pPr>
+        <w:spacing w:before="100" w:beforeAutospacing="1" w:after="100" w:afterAutospacing="1"/>
+      </w:pPr>
+      <w:r>
+        <w:t>I'm getting ready to open it up, but before I do, I'm looking for a handful of serious park people to use it and tell me what I've gotten wrong.</w:t>
+      </w:r>
+    </w:p>
+    <w:p>
+      <w:pPr>
+        <w:spacing w:before="100" w:beforeAutospacing="1" w:after="100" w:afterAutospacing="1"/>
+      </w:pPr>
+      <w:r>
+        <w:t>No posting obligation at all. I genuinely want your feedback.</w:t>
+      </w:r>
+    </w:p>
+    <w:bookmarkEnd w:id="4"/>
+    <w:bookmarkEnd w:id="5"/>
+    <w:p>
+      <w:pPr>
+        <w:spacing w:before="100" w:beforeAutospacing="1" w:after="100" w:afterAutospacing="1"/>
+      </w:pPr>
+      <w:r>
+        <w:t>Would you be up for early access?</w:t>
+      </w:r>
+    </w:p>
+    <w:p>
+      <w:pPr>
+        <w:spacing w:before="100" w:beforeAutospacing="1" w:after="100" w:afterAutospacing="1"/>
+      </w:pPr>
+      <w:r>
+        <w:rPr>
+          <w:b/>
+          <w:bCs/>
+        </w:rPr>
+        <w:t>That last sentence — “No posting obligation at all” — is the part I think gets you the organic posts.</w:t>
+      </w:r>
+    </w:p>
+    <w:p>
+      <w:pPr>
+        <w:spacing w:before="100" w:beforeAutospacing="1" w:after="100" w:afterAutospacing="1"/>
+      </w:pPr>
+      <w:r>
+        <w:t xml:space="preserve">If the app is good and you make them feel like insiders, 2–3 will probably show it because </w:t>
+      </w:r>
+      <w:r>
+        <w:rPr>
+          <w:i/>
+          <w:iCs/>
+        </w:rPr>
+        <w:t>they discovered something their audience would like</w:t>
+      </w:r>
+      <w:r>
+        <w:t>, rather than because you asked them to advertise ParkAtlas.</w:t>
+      </w:r>
+    </w:p>
+    <w:p>
+      <w:pPr>
+        <w:spacing w:before="100" w:beforeAutospacing="1" w:after="100" w:afterAutospacing="1"/>
+      </w:pPr>
+      <w:r>
+        <w:t xml:space="preserve">I would build a </w:t>
+      </w:r>
+      <w:r>
+        <w:rPr>
+          <w:b/>
+          <w:bCs/>
+        </w:rPr>
+        <w:t>target list of ~25 creators</w:t>
+      </w:r>
+      <w:r>
+        <w:t xml:space="preserve">, contact the best 10 first, aim for </w:t>
+      </w:r>
+      <w:r>
+        <w:rPr>
+          <w:b/>
+          <w:bCs/>
+        </w:rPr>
+        <w:t>5–7 actual testers</w:t>
+      </w:r>
+      <w:r>
+        <w:t xml:space="preserve">, and hope for </w:t>
+      </w:r>
+      <w:r>
+        <w:rPr>
+          <w:b/>
+          <w:bCs/>
+        </w:rPr>
+        <w:t>2–3 organic posts</w:t>
+      </w:r>
+      <w:r>
+        <w:t>. That's a much healthier funnel than finding three creators and hoping all three post.</w:t>
+      </w:r>
+    </w:p>
+    <w:p>
+      <w:pPr>
+        <w:spacing w:before="100" w:beforeAutospacing="1" w:after="100" w:afterAutospacing="1"/>
+      </w:pPr>
+      <w:r>
+        <w:t xml:space="preserve">I can go another level deeper now and build you a </w:t>
+      </w:r>
+      <w:r>
+        <w:rPr>
+          <w:b/>
+          <w:bCs/>
+        </w:rPr>
+        <w:t>25-person ParkAtlas creator prospect list with Instagram handle, current follower count, park count, content style, contact method/email if public, and a 1–5 “likelihood they'll respond” score</w:t>
+      </w:r>
+      <w:r>
+        <w:t>, then rank exactly who you should DM first.</w:t>
       </w:r>
     </w:p>
     <w:p/>
-    <w:p>
-      <w:r>
-        <w:t>Updated todo list</w:t>
-      </w:r>
-    </w:p>
-    <w:p/>
-    <w:p>
-      <w:r>
-        <w:t>## Next steps</w:t>
-      </w:r>
-    </w:p>
-    <w:p/>
-    <w:p>
-      <w:r>
-        <w:t>**Ship 2.0 (today/tomorrow)**</w:t>
-      </w:r>
-    </w:p>
-    <w:p>
-      <w:r>
-        <w:t>1. App Store Connect → ParkAtlas → 2.0: once build **38** finishes processing, select it under *Build*.</w:t>
-      </w:r>
-    </w:p>
-    <w:p>
-      <w:r>
-        <w:t>2. Media: 6.9" → drop `app-preview-6.9.mp4` + the six PNGs from `upload-assets-2.0-overlay`; iPad 13" → the six from `upload-assets-ipad-2.0-overlay`.</w:t>
-      </w:r>
-    </w:p>
-    <w:p>
-      <w:r>
-        <w:t>3. What's New + description (copy from earlier), then **Add for Review → Submit**.</w:t>
-      </w:r>
-    </w:p>
-    <w:p>
-      <w:r>
-        <w:t>4. After approval: open `https://parkatlas.io/invite/test` on your phone to confirm universal links launch the app.</w:t>
-      </w:r>
-    </w:p>
-    <w:p/>
-    <w:p>
-      <w:r>
-        <w:t>**Site / growth plumbing (this week)**</w:t>
-      </w:r>
-    </w:p>
-    <w:p>
-      <w:r>
-        <w:t>5. Buttondown: rename newsletter to "ParkAtlas", set the welcome email to include the checklist PDF link.</w:t>
-      </w:r>
-    </w:p>
-    <w:p>
-      <w:r>
-        <w:t>6. Email: decide M365 vs. GoDaddy forwarding for [hello@parkatlas.io](mailto:hello@parkatlas.io), then fix the SPF record to match. Until then support mail may bounce.</w:t>
-      </w:r>
-    </w:p>
-    <w:p>
-      <w:r>
-        <w:t>7. Google Search Console: add the TXT record, verify parkatlas.io, submit `https://parkatlas.io/sitemap.xml` (66 URLs).</w:t>
-      </w:r>
-    </w:p>
-    <w:p>
-      <w:r>
-        <w:t>8. Content: run `record-batch.sh` for the Reels/TikTok library and start the week</w:t>
-      </w:r>
-      <w:r>
-        <w:rPr>
-          <w:rFonts w:ascii="Cambria Math" w:hAnsi="Cambria Math" w:cs="Cambria Math"/>
-        </w:rPr>
-        <w:t>‑</w:t>
-      </w:r>
-      <w:r>
-        <w:t>1 posts in `posts-weeks-1-4.md`. Tag @parkatlas.io reshares.</w:t>
-      </w:r>
-    </w:p>
-    <w:p/>
-    <w:p>
-      <w:r>
-        <w:t>**Build 39 (2.1) backlog**</w:t>
-      </w:r>
-    </w:p>
-    <w:p>
-      <w:r>
-        <w:t>9. Soften share-card copy ("free", "of 63") to match the site's outdoors-first voice.</w:t>
-      </w:r>
-    </w:p>
-    <w:p>
-      <w:r>
-        <w:t>10. Google Sign-In: create iOS + web client IDs in Google Cloud, set `EXPO_PUBLIC_GOOGLE_IOS_CLIENT_ID` in EAS, re-add the plugin.</w:t>
-      </w:r>
-    </w:p>
-    <w:p>
-      <w:r>
-        <w:t>11. RevenueCat Pro paywall; two-column iPad layout.</w:t>
-      </w:r>
-    </w:p>
-    <w:p/>
-    <w:p>
-      <w:r>
-        <w:t>## Affiliates and advertising on parkatlas.io</w:t>
-      </w:r>
-    </w:p>
-    <w:p/>
-    <w:p>
-      <w:r>
-        <w:t>Two different things — approach both, but affiliates first because they need no permission.</w:t>
-      </w:r>
-    </w:p>
-    <w:p/>
-    <w:p>
-      <w:r>
-        <w:t>**A. Affiliate programs (apply; no outreach needed).** Best fits for park pages:</w:t>
-      </w:r>
-    </w:p>
-    <w:p>
-      <w:r>
-        <w:t>- **Amazon Associates** — gear, guidebooks, the America the Beautiful pass. Easiest approval; note you need qualifying sales within the first 180 days or the account closes.</w:t>
-      </w:r>
-    </w:p>
-    <w:p>
-      <w:r>
-        <w:t>- **REI, Backcountry, Moosejaw** — outdoor retailers typically run through networks like **AvantLink** or **Impact**; apply on the network, then to each brand.</w:t>
-      </w:r>
-    </w:p>
-    <w:p>
-      <w:r>
-        <w:t>- **Lodging/experiences** — **Booking.com**, **Expedia**, **Hipcamp**, **Viator/GetYourGuide** all have affiliate programs (direct or via Impact/CJ/Awin). Put "Where to stay near Zion" blocks on park pages.</w:t>
-      </w:r>
-    </w:p>
-    <w:p>
-      <w:r>
-        <w:t>- **AllTrails**, **Gaia GPS**, **onX** — check their sites for an affiliate/partner page; they come and go.</w:t>
-      </w:r>
-    </w:p>
-    <w:p/>
-    <w:p>
-      <w:r>
-        <w:t>What they look for when approving: a live site with real content (you have 63 pages), a privacy policy (done), and an FTC disclosure line ("Some links are affiliate links; we may earn a commission at no cost to you") — add that to the park-page footer before applying. Application typically takes days to a couple of weeks; several reject sites under ~1k monthly visits, so Search Console + Instagram traffic first helps.</w:t>
-      </w:r>
-    </w:p>
-    <w:p/>
-    <w:p>
-      <w:r>
-        <w:t>**B. Direct sponsors/advertisers (outreach).** Realistic targets at your stage are small outdoor brands, park-adjacent lodges/outfitters, and other indie apps — not REI's marketing team. Good angles: a "Presented by" slot on the checklist PDF, a sponsor card on the parks index, or a sponsored newsletter issue.</w:t>
-      </w:r>
-    </w:p>
-    <w:p/>
-    <w:p>
-      <w:r>
-        <w:t>Find contacts: brand site → "Partnerships"/"Press" page, or LinkedIn for "partnerships", "affiliate manager", "brand marketing". Instagram DM works for small brands.</w:t>
-      </w:r>
-    </w:p>
-    <w:p/>
-    <w:p>
-      <w:r>
-        <w:t>Template (short; one ask; numbers when you have them):</w:t>
-      </w:r>
-    </w:p>
-    <w:p/>
-    <w:p>
-      <w:r>
-        <w:t>&gt; Subject: ParkAtlas × [Brand] — reaching national park travelers</w:t>
-      </w:r>
-    </w:p>
-    <w:p>
-      <w:r>
-        <w:t>&gt;</w:t>
-      </w:r>
-    </w:p>
-    <w:p>
-      <w:r>
-        <w:lastRenderedPageBreak/>
-        <w:t>&gt; Hi [Name] — I'm Karen, founder of ParkAtlas, an iOS app and site (parkatlas.io) for people who track and plan their national and state park trips. We publish guides for all 63 national parks and a free printable checklist that's downloaded [N] times a month; our audience is [N] monthly visitors / [N] Instagram followers who are actively planning trips.</w:t>
-      </w:r>
-    </w:p>
-    <w:p>
-      <w:r>
-        <w:t>&gt;</w:t>
-      </w:r>
-    </w:p>
-    <w:p>
-      <w:r>
-        <w:t>&gt; I'd love to feature [Brand] as the sponsor of our [Zion/Utah parks] pages and the September checklist mailing. Packages start at $[X] for a month, or I'm glad to work on an affiliate/rev-share basis if you prefer.</w:t>
-      </w:r>
-    </w:p>
-    <w:p>
-      <w:r>
-        <w:t>&gt;</w:t>
-      </w:r>
-    </w:p>
-    <w:p>
-      <w:r>
-        <w:t>&gt; Would a 15-minute call next week work? Happy to send a media kit.</w:t>
-      </w:r>
-    </w:p>
-    <w:p/>
-    <w:p>
-      <w:r>
-        <w:t>Build a one-page media kit (audience, screenshots, page list, pricing) before sending — I can generate it from the site assets when you're ready. Rule of thumb for pricing early on: ~$10–20 CPM equivalent for display, or just start with affiliate/rev-share until you have traffic numbers to sell against.</w:t>
-      </w:r>
-    </w:p>
-    <w:p/>
-    <w:p>
-      <w:r>
-        <w:t>Want me to add the FTC disclosure line and an affiliate-ready "Plan your trip" block to the park-page template now, so the pages are approval-ready when you apply?</w:t>
-      </w:r>
-    </w:p>
     <w:sectPr>
       <w:pgSz w:w="12240" w:h="15840"/>
       <w:pgMar w:top="1440" w:right="1440" w:bottom="1440" w:left="1440" w:header="720" w:footer="720" w:gutter="0"/>
@@ -4009,9 +4146,11 @@
   <w:style w:type="paragraph" w:default="1" w:styleId="Normal">
     <w:name w:val="Normal"/>
     <w:qFormat/>
-    <w:rsid w:val="009E5E3F"/>
+    <w:rsid w:val="00A9186F"/>
     <w:rPr>
-      <w:sz w:val="20"/>
+      <w:rFonts w:ascii="Times New Roman" w:eastAsia="Times New Roman" w:hAnsi="Times New Roman" w:cs="Times New Roman"/>
+      <w:kern w:val="0"/>
+      <w14:ligatures w14:val="none"/>
     </w:rPr>
   </w:style>
   <w:style w:type="paragraph" w:styleId="Heading1">
@@ -4031,8 +4170,10 @@
     <w:rPr>
       <w:rFonts w:asciiTheme="majorHAnsi" w:eastAsiaTheme="majorEastAsia" w:hAnsiTheme="majorHAnsi" w:cstheme="majorBidi"/>
       <w:color w:val="0F4761" w:themeColor="accent1" w:themeShade="BF"/>
+      <w:kern w:val="2"/>
       <w:sz w:val="40"/>
       <w:szCs w:val="40"/>
+      <w14:ligatures w14:val="standardContextual"/>
     </w:rPr>
   </w:style>
   <w:style w:type="paragraph" w:styleId="Heading2">
@@ -4053,8 +4194,10 @@
     <w:rPr>
       <w:rFonts w:asciiTheme="majorHAnsi" w:eastAsiaTheme="majorEastAsia" w:hAnsiTheme="majorHAnsi" w:cstheme="majorBidi"/>
       <w:color w:val="0F4761" w:themeColor="accent1" w:themeShade="BF"/>
+      <w:kern w:val="2"/>
       <w:sz w:val="32"/>
       <w:szCs w:val="32"/>
+      <w14:ligatures w14:val="standardContextual"/>
     </w:rPr>
   </w:style>
   <w:style w:type="paragraph" w:styleId="Heading3">
@@ -4063,7 +4206,6 @@
     <w:next w:val="Normal"/>
     <w:link w:val="Heading3Char"/>
     <w:uiPriority w:val="9"/>
-    <w:semiHidden/>
     <w:unhideWhenUsed/>
     <w:qFormat/>
     <w:rsid w:val="000E7A0D"/>
@@ -4074,10 +4216,12 @@
       <w:outlineLvl w:val="2"/>
     </w:pPr>
     <w:rPr>
-      <w:rFonts w:eastAsiaTheme="majorEastAsia" w:cstheme="majorBidi"/>
+      <w:rFonts w:asciiTheme="minorHAnsi" w:eastAsiaTheme="majorEastAsia" w:hAnsiTheme="minorHAnsi" w:cstheme="majorBidi"/>
       <w:color w:val="0F4761" w:themeColor="accent1" w:themeShade="BF"/>
+      <w:kern w:val="2"/>
       <w:sz w:val="28"/>
       <w:szCs w:val="28"/>
+      <w14:ligatures w14:val="standardContextual"/>
     </w:rPr>
   </w:style>
   <w:style w:type="paragraph" w:styleId="Heading4">
@@ -4097,10 +4241,13 @@
       <w:outlineLvl w:val="3"/>
     </w:pPr>
     <w:rPr>
-      <w:rFonts w:eastAsiaTheme="majorEastAsia" w:cstheme="majorBidi"/>
+      <w:rFonts w:asciiTheme="minorHAnsi" w:eastAsiaTheme="majorEastAsia" w:hAnsiTheme="minorHAnsi" w:cstheme="majorBidi"/>
       <w:i/>
       <w:iCs/>
       <w:color w:val="0F4761" w:themeColor="accent1" w:themeShade="BF"/>
+      <w:kern w:val="2"/>
+      <w:sz w:val="20"/>
+      <w14:ligatures w14:val="standardContextual"/>
     </w:rPr>
   </w:style>
   <w:style w:type="paragraph" w:styleId="Heading5">
@@ -4120,8 +4267,11 @@
       <w:outlineLvl w:val="4"/>
     </w:pPr>
     <w:rPr>
-      <w:rFonts w:eastAsiaTheme="majorEastAsia" w:cstheme="majorBidi"/>
+      <w:rFonts w:asciiTheme="minorHAnsi" w:eastAsiaTheme="majorEastAsia" w:hAnsiTheme="minorHAnsi" w:cstheme="majorBidi"/>
       <w:color w:val="0F4761" w:themeColor="accent1" w:themeShade="BF"/>
+      <w:kern w:val="2"/>
+      <w:sz w:val="20"/>
+      <w14:ligatures w14:val="standardContextual"/>
     </w:rPr>
   </w:style>
   <w:style w:type="paragraph" w:styleId="Heading6">
@@ -4141,10 +4291,13 @@
       <w:outlineLvl w:val="5"/>
     </w:pPr>
     <w:rPr>
-      <w:rFonts w:eastAsiaTheme="majorEastAsia" w:cstheme="majorBidi"/>
+      <w:rFonts w:asciiTheme="minorHAnsi" w:eastAsiaTheme="majorEastAsia" w:hAnsiTheme="minorHAnsi" w:cstheme="majorBidi"/>
       <w:i/>
       <w:iCs/>
       <w:color w:val="595959" w:themeColor="text1" w:themeTint="A6"/>
+      <w:kern w:val="2"/>
+      <w:sz w:val="20"/>
+      <w14:ligatures w14:val="standardContextual"/>
     </w:rPr>
   </w:style>
   <w:style w:type="paragraph" w:styleId="Heading7">
@@ -4164,8 +4317,11 @@
       <w:outlineLvl w:val="6"/>
     </w:pPr>
     <w:rPr>
-      <w:rFonts w:eastAsiaTheme="majorEastAsia" w:cstheme="majorBidi"/>
+      <w:rFonts w:asciiTheme="minorHAnsi" w:eastAsiaTheme="majorEastAsia" w:hAnsiTheme="minorHAnsi" w:cstheme="majorBidi"/>
       <w:color w:val="595959" w:themeColor="text1" w:themeTint="A6"/>
+      <w:kern w:val="2"/>
+      <w:sz w:val="20"/>
+      <w14:ligatures w14:val="standardContextual"/>
     </w:rPr>
   </w:style>
   <w:style w:type="paragraph" w:styleId="Heading8">
@@ -4184,10 +4340,13 @@
       <w:outlineLvl w:val="7"/>
     </w:pPr>
     <w:rPr>
-      <w:rFonts w:eastAsiaTheme="majorEastAsia" w:cstheme="majorBidi"/>
+      <w:rFonts w:asciiTheme="minorHAnsi" w:eastAsiaTheme="majorEastAsia" w:hAnsiTheme="minorHAnsi" w:cstheme="majorBidi"/>
       <w:i/>
       <w:iCs/>
       <w:color w:val="272727" w:themeColor="text1" w:themeTint="D8"/>
+      <w:kern w:val="2"/>
+      <w:sz w:val="20"/>
+      <w14:ligatures w14:val="standardContextual"/>
     </w:rPr>
   </w:style>
   <w:style w:type="paragraph" w:styleId="Heading9">
@@ -4206,8 +4365,11 @@
       <w:outlineLvl w:val="8"/>
     </w:pPr>
     <w:rPr>
-      <w:rFonts w:eastAsiaTheme="majorEastAsia" w:cstheme="majorBidi"/>
+      <w:rFonts w:asciiTheme="minorHAnsi" w:eastAsiaTheme="majorEastAsia" w:hAnsiTheme="minorHAnsi" w:cstheme="majorBidi"/>
       <w:color w:val="272727" w:themeColor="text1" w:themeTint="D8"/>
+      <w:kern w:val="2"/>
+      <w:sz w:val="20"/>
+      <w14:ligatures w14:val="standardContextual"/>
     </w:rPr>
   </w:style>
   <w:style w:type="character" w:default="1" w:styleId="DefaultParagraphFont">
@@ -4268,7 +4430,6 @@
     <w:basedOn w:val="DefaultParagraphFont"/>
     <w:link w:val="Heading3"/>
     <w:uiPriority w:val="9"/>
-    <w:semiHidden/>
     <w:rsid w:val="000E7A0D"/>
     <w:rPr>
       <w:rFonts w:eastAsiaTheme="majorEastAsia" w:cstheme="majorBidi"/>
@@ -4379,6 +4540,7 @@
       <w:kern w:val="28"/>
       <w:sz w:val="56"/>
       <w:szCs w:val="56"/>
+      <w14:ligatures w14:val="standardContextual"/>
     </w:rPr>
   </w:style>
   <w:style w:type="character" w:customStyle="1" w:styleId="TitleChar">
@@ -4410,11 +4572,13 @@
       <w:spacing w:after="160"/>
     </w:pPr>
     <w:rPr>
-      <w:rFonts w:eastAsiaTheme="majorEastAsia" w:cstheme="majorBidi"/>
+      <w:rFonts w:asciiTheme="minorHAnsi" w:eastAsiaTheme="majorEastAsia" w:hAnsiTheme="minorHAnsi" w:cstheme="majorBidi"/>
       <w:color w:val="595959" w:themeColor="text1" w:themeTint="A6"/>
       <w:spacing w:val="15"/>
+      <w:kern w:val="2"/>
       <w:sz w:val="28"/>
       <w:szCs w:val="28"/>
+      <w14:ligatures w14:val="standardContextual"/>
     </w:rPr>
   </w:style>
   <w:style w:type="character" w:customStyle="1" w:styleId="SubtitleChar">
@@ -4444,9 +4608,13 @@
       <w:jc w:val="center"/>
     </w:pPr>
     <w:rPr>
+      <w:rFonts w:asciiTheme="minorHAnsi" w:eastAsiaTheme="minorHAnsi" w:hAnsiTheme="minorHAnsi" w:cstheme="minorBidi"/>
       <w:i/>
       <w:iCs/>
       <w:color w:val="404040" w:themeColor="text1" w:themeTint="BF"/>
+      <w:kern w:val="2"/>
+      <w:sz w:val="20"/>
+      <w14:ligatures w14:val="standardContextual"/>
     </w:rPr>
   </w:style>
   <w:style w:type="character" w:customStyle="1" w:styleId="QuoteChar">
@@ -4472,6 +4640,12 @@
       <w:ind w:left="720"/>
       <w:contextualSpacing/>
     </w:pPr>
+    <w:rPr>
+      <w:rFonts w:asciiTheme="minorHAnsi" w:eastAsiaTheme="minorHAnsi" w:hAnsiTheme="minorHAnsi" w:cstheme="minorBidi"/>
+      <w:kern w:val="2"/>
+      <w:sz w:val="20"/>
+      <w14:ligatures w14:val="standardContextual"/>
+    </w:rPr>
   </w:style>
   <w:style w:type="character" w:styleId="IntenseEmphasis">
     <w:name w:val="Intense Emphasis"/>
@@ -4503,9 +4677,13 @@
       <w:jc w:val="center"/>
     </w:pPr>
     <w:rPr>
+      <w:rFonts w:asciiTheme="minorHAnsi" w:eastAsiaTheme="minorHAnsi" w:hAnsiTheme="minorHAnsi" w:cstheme="minorBidi"/>
       <w:i/>
       <w:iCs/>
       <w:color w:val="0F4761" w:themeColor="accent1" w:themeShade="BF"/>
+      <w:kern w:val="2"/>
+      <w:sz w:val="20"/>
+      <w14:ligatures w14:val="standardContextual"/>
     </w:rPr>
   </w:style>
   <w:style w:type="character" w:customStyle="1" w:styleId="IntenseQuoteChar">
@@ -4545,12 +4723,6 @@
     <w:pPr>
       <w:spacing w:before="100" w:beforeAutospacing="1" w:after="100" w:afterAutospacing="1"/>
     </w:pPr>
-    <w:rPr>
-      <w:rFonts w:ascii="Times New Roman" w:eastAsia="Times New Roman" w:hAnsi="Times New Roman" w:cs="Times New Roman"/>
-      <w:kern w:val="0"/>
-      <w:sz w:val="24"/>
-      <w14:ligatures w14:val="none"/>
-    </w:rPr>
   </w:style>
   <w:style w:type="character" w:styleId="Strong">
     <w:name w:val="Strong"/>
@@ -4585,6 +4757,18 @@
     <w:rPr>
       <w:i/>
       <w:iCs/>
+    </w:rPr>
+  </w:style>
+  <w:style w:type="character" w:styleId="Hyperlink">
+    <w:name w:val="Hyperlink"/>
+    <w:basedOn w:val="DefaultParagraphFont"/>
+    <w:uiPriority w:val="99"/>
+    <w:semiHidden/>
+    <w:unhideWhenUsed/>
+    <w:rsid w:val="00A9186F"/>
+    <w:rPr>
+      <w:color w:val="0000FF"/>
+      <w:u w:val="single"/>
     </w:rPr>
   </w:style>
 </w:styles>

</xml_diff>